<commit_message>
Added the updated URS
</commit_message>
<xml_diff>
--- a/6 URS/URS 1.0.docx
+++ b/6 URS/URS 1.0.docx
@@ -7,7 +7,7 @@
         <w:spacing w:after="60" w:line="240" w:lineRule="auto"/>
         <w:jc w:val="center"/>
         <w:rPr>
-          <w:rFonts w:ascii="Times New Roman" w:eastAsia="Times New Roman" w:hAnsi="Times New Roman" w:cs="Times New Roman"/>
+          <w:rFonts w:ascii="Arial" w:eastAsia="Times New Roman" w:hAnsi="Arial" w:cs="Arial"/>
           <w:sz w:val="24"/>
           <w:szCs w:val="24"/>
           <w:lang w:eastAsia="pl-PL"/>
@@ -38,7 +38,7 @@
       <w:pPr>
         <w:spacing w:after="240" w:line="240" w:lineRule="auto"/>
         <w:rPr>
-          <w:rFonts w:ascii="Times New Roman" w:eastAsia="Times New Roman" w:hAnsi="Times New Roman" w:cs="Times New Roman"/>
+          <w:rFonts w:ascii="Arial" w:eastAsia="Times New Roman" w:hAnsi="Arial" w:cs="Arial"/>
           <w:sz w:val="24"/>
           <w:szCs w:val="24"/>
           <w:lang w:eastAsia="pl-PL"/>
@@ -60,7 +60,7 @@
       <w:pPr>
         <w:spacing w:after="0" w:line="240" w:lineRule="auto"/>
         <w:rPr>
-          <w:rFonts w:ascii="Times New Roman" w:eastAsia="Times New Roman" w:hAnsi="Times New Roman" w:cs="Times New Roman"/>
+          <w:rFonts w:ascii="Arial" w:eastAsia="Times New Roman" w:hAnsi="Arial" w:cs="Arial"/>
           <w:sz w:val="24"/>
           <w:szCs w:val="24"/>
           <w:lang w:eastAsia="pl-PL"/>
@@ -71,7 +71,7 @@
       <w:pPr>
         <w:spacing w:after="240" w:line="240" w:lineRule="auto"/>
         <w:rPr>
-          <w:rFonts w:ascii="Times New Roman" w:eastAsia="Times New Roman" w:hAnsi="Times New Roman" w:cs="Times New Roman"/>
+          <w:rFonts w:ascii="Arial" w:eastAsia="Times New Roman" w:hAnsi="Arial" w:cs="Arial"/>
           <w:sz w:val="24"/>
           <w:szCs w:val="24"/>
           <w:lang w:eastAsia="pl-PL"/>
@@ -79,7 +79,7 @@
       </w:pPr>
       <w:r>
         <w:rPr>
-          <w:rFonts w:ascii="Times New Roman" w:eastAsia="Times New Roman" w:hAnsi="Times New Roman" w:cs="Times New Roman"/>
+          <w:rFonts w:ascii="Arial" w:eastAsia="Times New Roman" w:hAnsi="Arial" w:cs="Arial"/>
           <w:sz w:val="24"/>
           <w:szCs w:val="24"/>
           <w:lang w:eastAsia="pl-PL"/>
@@ -157,7 +157,7 @@
       </w:r>
       <w:r>
         <w:rPr>
-          <w:rFonts w:ascii="Times New Roman" w:eastAsia="Times New Roman" w:hAnsi="Times New Roman" w:cs="Times New Roman"/>
+          <w:rFonts w:ascii="Arial" w:eastAsia="Times New Roman" w:hAnsi="Arial" w:cs="Arial"/>
           <w:sz w:val="24"/>
           <w:szCs w:val="24"/>
           <w:lang w:eastAsia="pl-PL"/>
@@ -166,7 +166,7 @@
       </w:r>
       <w:r>
         <w:rPr>
-          <w:rFonts w:ascii="Times New Roman" w:eastAsia="Times New Roman" w:hAnsi="Times New Roman" w:cs="Times New Roman"/>
+          <w:rFonts w:ascii="Arial" w:eastAsia="Times New Roman" w:hAnsi="Arial" w:cs="Arial"/>
           <w:sz w:val="24"/>
           <w:szCs w:val="24"/>
           <w:lang w:eastAsia="pl-PL"/>
@@ -175,7 +175,7 @@
       </w:r>
       <w:r>
         <w:rPr>
-          <w:rFonts w:ascii="Times New Roman" w:eastAsia="Times New Roman" w:hAnsi="Times New Roman" w:cs="Times New Roman"/>
+          <w:rFonts w:ascii="Arial" w:eastAsia="Times New Roman" w:hAnsi="Arial" w:cs="Arial"/>
           <w:sz w:val="24"/>
           <w:szCs w:val="24"/>
           <w:lang w:eastAsia="pl-PL"/>
@@ -184,7 +184,7 @@
       </w:r>
       <w:r>
         <w:rPr>
-          <w:rFonts w:ascii="Times New Roman" w:eastAsia="Times New Roman" w:hAnsi="Times New Roman" w:cs="Times New Roman"/>
+          <w:rFonts w:ascii="Arial" w:eastAsia="Times New Roman" w:hAnsi="Arial" w:cs="Arial"/>
           <w:sz w:val="24"/>
           <w:szCs w:val="24"/>
           <w:lang w:eastAsia="pl-PL"/>
@@ -193,7 +193,7 @@
       </w:r>
       <w:r>
         <w:rPr>
-          <w:rFonts w:ascii="Times New Roman" w:eastAsia="Times New Roman" w:hAnsi="Times New Roman" w:cs="Times New Roman"/>
+          <w:rFonts w:ascii="Arial" w:eastAsia="Times New Roman" w:hAnsi="Arial" w:cs="Arial"/>
           <w:sz w:val="24"/>
           <w:szCs w:val="24"/>
           <w:lang w:eastAsia="pl-PL"/>
@@ -202,7 +202,7 @@
       </w:r>
       <w:r>
         <w:rPr>
-          <w:rFonts w:ascii="Times New Roman" w:eastAsia="Times New Roman" w:hAnsi="Times New Roman" w:cs="Times New Roman"/>
+          <w:rFonts w:ascii="Arial" w:eastAsia="Times New Roman" w:hAnsi="Arial" w:cs="Arial"/>
           <w:sz w:val="24"/>
           <w:szCs w:val="24"/>
           <w:lang w:eastAsia="pl-PL"/>
@@ -211,7 +211,7 @@
       </w:r>
       <w:r>
         <w:rPr>
-          <w:rFonts w:ascii="Times New Roman" w:eastAsia="Times New Roman" w:hAnsi="Times New Roman" w:cs="Times New Roman"/>
+          <w:rFonts w:ascii="Arial" w:eastAsia="Times New Roman" w:hAnsi="Arial" w:cs="Arial"/>
           <w:sz w:val="24"/>
           <w:szCs w:val="24"/>
           <w:lang w:eastAsia="pl-PL"/>
@@ -220,7 +220,7 @@
       </w:r>
       <w:r>
         <w:rPr>
-          <w:rFonts w:ascii="Times New Roman" w:eastAsia="Times New Roman" w:hAnsi="Times New Roman" w:cs="Times New Roman"/>
+          <w:rFonts w:ascii="Arial" w:eastAsia="Times New Roman" w:hAnsi="Arial" w:cs="Arial"/>
           <w:sz w:val="24"/>
           <w:szCs w:val="24"/>
           <w:lang w:eastAsia="pl-PL"/>
@@ -229,7 +229,7 @@
       </w:r>
       <w:r>
         <w:rPr>
-          <w:rFonts w:ascii="Times New Roman" w:eastAsia="Times New Roman" w:hAnsi="Times New Roman" w:cs="Times New Roman"/>
+          <w:rFonts w:ascii="Arial" w:eastAsia="Times New Roman" w:hAnsi="Arial" w:cs="Arial"/>
           <w:sz w:val="24"/>
           <w:szCs w:val="24"/>
           <w:lang w:eastAsia="pl-PL"/>
@@ -238,7 +238,7 @@
       </w:r>
       <w:r>
         <w:rPr>
-          <w:rFonts w:ascii="Times New Roman" w:eastAsia="Times New Roman" w:hAnsi="Times New Roman" w:cs="Times New Roman"/>
+          <w:rFonts w:ascii="Arial" w:eastAsia="Times New Roman" w:hAnsi="Arial" w:cs="Arial"/>
           <w:sz w:val="24"/>
           <w:szCs w:val="24"/>
           <w:lang w:eastAsia="pl-PL"/>
@@ -247,7 +247,7 @@
       </w:r>
       <w:r>
         <w:rPr>
-          <w:rFonts w:ascii="Times New Roman" w:eastAsia="Times New Roman" w:hAnsi="Times New Roman" w:cs="Times New Roman"/>
+          <w:rFonts w:ascii="Arial" w:eastAsia="Times New Roman" w:hAnsi="Arial" w:cs="Arial"/>
           <w:sz w:val="24"/>
           <w:szCs w:val="24"/>
           <w:lang w:eastAsia="pl-PL"/>
@@ -256,7 +256,7 @@
       </w:r>
       <w:r>
         <w:rPr>
-          <w:rFonts w:ascii="Times New Roman" w:eastAsia="Times New Roman" w:hAnsi="Times New Roman" w:cs="Times New Roman"/>
+          <w:rFonts w:ascii="Arial" w:eastAsia="Times New Roman" w:hAnsi="Arial" w:cs="Arial"/>
           <w:sz w:val="24"/>
           <w:szCs w:val="24"/>
           <w:lang w:eastAsia="pl-PL"/>
@@ -265,7 +265,7 @@
       </w:r>
       <w:r>
         <w:rPr>
-          <w:rFonts w:ascii="Times New Roman" w:eastAsia="Times New Roman" w:hAnsi="Times New Roman" w:cs="Times New Roman"/>
+          <w:rFonts w:ascii="Arial" w:eastAsia="Times New Roman" w:hAnsi="Arial" w:cs="Arial"/>
           <w:sz w:val="24"/>
           <w:szCs w:val="24"/>
           <w:lang w:eastAsia="pl-PL"/>
@@ -277,7 +277,7 @@
       <w:pPr>
         <w:spacing w:after="240" w:line="240" w:lineRule="auto"/>
         <w:rPr>
-          <w:rFonts w:ascii="Times New Roman" w:eastAsia="Times New Roman" w:hAnsi="Times New Roman" w:cs="Times New Roman"/>
+          <w:rFonts w:ascii="Arial" w:eastAsia="Times New Roman" w:hAnsi="Arial" w:cs="Arial"/>
           <w:sz w:val="24"/>
           <w:szCs w:val="24"/>
           <w:lang w:eastAsia="pl-PL"/>
@@ -288,7 +288,7 @@
       <w:pPr>
         <w:spacing w:after="240" w:line="240" w:lineRule="auto"/>
         <w:rPr>
-          <w:rFonts w:ascii="Times New Roman" w:eastAsia="Times New Roman" w:hAnsi="Times New Roman" w:cs="Times New Roman"/>
+          <w:rFonts w:ascii="Arial" w:eastAsia="Times New Roman" w:hAnsi="Arial" w:cs="Arial"/>
           <w:sz w:val="24"/>
           <w:szCs w:val="24"/>
           <w:lang w:eastAsia="pl-PL"/>
@@ -299,7 +299,7 @@
       <w:pPr>
         <w:spacing w:after="240" w:line="240" w:lineRule="auto"/>
         <w:rPr>
-          <w:rFonts w:ascii="Times New Roman" w:eastAsia="Times New Roman" w:hAnsi="Times New Roman" w:cs="Times New Roman"/>
+          <w:rFonts w:ascii="Arial" w:eastAsia="Times New Roman" w:hAnsi="Arial" w:cs="Arial"/>
           <w:sz w:val="24"/>
           <w:szCs w:val="24"/>
           <w:lang w:eastAsia="pl-PL"/>
@@ -310,7 +310,7 @@
       <w:pPr>
         <w:spacing w:after="240" w:line="240" w:lineRule="auto"/>
         <w:rPr>
-          <w:rFonts w:ascii="Times New Roman" w:eastAsia="Times New Roman" w:hAnsi="Times New Roman" w:cs="Times New Roman"/>
+          <w:rFonts w:ascii="Arial" w:eastAsia="Times New Roman" w:hAnsi="Arial" w:cs="Arial"/>
           <w:sz w:val="24"/>
           <w:szCs w:val="24"/>
           <w:lang w:eastAsia="pl-PL"/>
@@ -321,7 +321,7 @@
       <w:pPr>
         <w:spacing w:after="240" w:line="240" w:lineRule="auto"/>
         <w:rPr>
-          <w:rFonts w:ascii="Times New Roman" w:eastAsia="Times New Roman" w:hAnsi="Times New Roman" w:cs="Times New Roman"/>
+          <w:rFonts w:ascii="Arial" w:eastAsia="Times New Roman" w:hAnsi="Arial" w:cs="Arial"/>
           <w:sz w:val="24"/>
           <w:szCs w:val="24"/>
           <w:lang w:eastAsia="pl-PL"/>
@@ -332,7 +332,7 @@
       <w:pPr>
         <w:spacing w:after="240" w:line="240" w:lineRule="auto"/>
         <w:rPr>
-          <w:rFonts w:ascii="Times New Roman" w:eastAsia="Times New Roman" w:hAnsi="Times New Roman" w:cs="Times New Roman"/>
+          <w:rFonts w:ascii="Arial" w:eastAsia="Times New Roman" w:hAnsi="Arial" w:cs="Arial"/>
           <w:sz w:val="24"/>
           <w:szCs w:val="24"/>
           <w:lang w:eastAsia="pl-PL"/>
@@ -343,7 +343,7 @@
       <w:pPr>
         <w:spacing w:after="240" w:line="240" w:lineRule="auto"/>
         <w:rPr>
-          <w:rFonts w:ascii="Times New Roman" w:eastAsia="Times New Roman" w:hAnsi="Times New Roman" w:cs="Times New Roman"/>
+          <w:rFonts w:ascii="Arial" w:eastAsia="Times New Roman" w:hAnsi="Arial" w:cs="Arial"/>
           <w:sz w:val="24"/>
           <w:szCs w:val="24"/>
           <w:lang w:eastAsia="pl-PL"/>
@@ -354,7 +354,7 @@
       <w:pPr>
         <w:spacing w:after="240" w:line="240" w:lineRule="auto"/>
         <w:rPr>
-          <w:rFonts w:ascii="Times New Roman" w:eastAsia="Times New Roman" w:hAnsi="Times New Roman" w:cs="Times New Roman"/>
+          <w:rFonts w:ascii="Arial" w:eastAsia="Times New Roman" w:hAnsi="Arial" w:cs="Arial"/>
           <w:sz w:val="24"/>
           <w:szCs w:val="24"/>
           <w:lang w:eastAsia="pl-PL"/>
@@ -365,7 +365,7 @@
       <w:pPr>
         <w:spacing w:after="240" w:line="240" w:lineRule="auto"/>
         <w:rPr>
-          <w:rFonts w:ascii="Times New Roman" w:eastAsia="Times New Roman" w:hAnsi="Times New Roman" w:cs="Times New Roman"/>
+          <w:rFonts w:ascii="Arial" w:eastAsia="Times New Roman" w:hAnsi="Arial" w:cs="Arial"/>
           <w:sz w:val="24"/>
           <w:szCs w:val="24"/>
           <w:lang w:eastAsia="pl-PL"/>
@@ -376,7 +376,7 @@
       <w:pPr>
         <w:spacing w:after="240" w:line="240" w:lineRule="auto"/>
         <w:rPr>
-          <w:rFonts w:ascii="Times New Roman" w:eastAsia="Times New Roman" w:hAnsi="Times New Roman" w:cs="Times New Roman"/>
+          <w:rFonts w:ascii="Arial" w:eastAsia="Times New Roman" w:hAnsi="Arial" w:cs="Arial"/>
           <w:sz w:val="24"/>
           <w:szCs w:val="24"/>
           <w:lang w:eastAsia="pl-PL"/>
@@ -387,7 +387,7 @@
       <w:pPr>
         <w:spacing w:after="240" w:line="240" w:lineRule="auto"/>
         <w:rPr>
-          <w:rFonts w:ascii="Times New Roman" w:eastAsia="Times New Roman" w:hAnsi="Times New Roman" w:cs="Times New Roman"/>
+          <w:rFonts w:ascii="Arial" w:eastAsia="Times New Roman" w:hAnsi="Arial" w:cs="Arial"/>
           <w:sz w:val="24"/>
           <w:szCs w:val="24"/>
           <w:lang w:eastAsia="pl-PL"/>
@@ -398,7 +398,7 @@
       <w:pPr>
         <w:spacing w:after="240" w:line="240" w:lineRule="auto"/>
         <w:rPr>
-          <w:rFonts w:ascii="Times New Roman" w:eastAsia="Times New Roman" w:hAnsi="Times New Roman" w:cs="Times New Roman"/>
+          <w:rFonts w:ascii="Arial" w:eastAsia="Times New Roman" w:hAnsi="Arial" w:cs="Arial"/>
           <w:sz w:val="24"/>
           <w:szCs w:val="24"/>
           <w:lang w:eastAsia="pl-PL"/>
@@ -446,7 +446,7 @@
               <w:spacing w:after="0" w:line="240" w:lineRule="auto"/>
               <w:ind w:left="100"/>
               <w:rPr>
-                <w:rFonts w:ascii="Times New Roman" w:eastAsia="Times New Roman" w:hAnsi="Times New Roman" w:cs="Times New Roman"/>
+                <w:rFonts w:ascii="Arial" w:eastAsia="Times New Roman" w:hAnsi="Arial" w:cs="Arial"/>
                 <w:sz w:val="24"/>
                 <w:szCs w:val="24"/>
                 <w:lang w:eastAsia="pl-PL"/>
@@ -493,6 +493,15 @@
                 <w:lang w:eastAsia="pl-PL"/>
               </w:rPr>
               <w:tab/>
+            </w:r>
+            <w:r>
+              <w:rPr>
+                <w:rFonts w:ascii="Arial" w:eastAsia="Times New Roman" w:hAnsi="Arial" w:cs="Arial"/>
+                <w:b/>
+                <w:bCs/>
+                <w:color w:val="353F49"/>
+                <w:lang w:eastAsia="pl-PL"/>
+              </w:rPr>
               <w:t>0</w:t>
             </w:r>
             <w:r>
@@ -513,7 +522,27 @@
                 <w:color w:val="353F49"/>
                 <w:lang w:eastAsia="pl-PL"/>
               </w:rPr>
-              <w:t>/04/2024</w:t>
+              <w:t>/0</w:t>
+            </w:r>
+            <w:r>
+              <w:rPr>
+                <w:rFonts w:ascii="Arial" w:eastAsia="Times New Roman" w:hAnsi="Arial" w:cs="Arial"/>
+                <w:b/>
+                <w:bCs/>
+                <w:color w:val="353F49"/>
+                <w:lang w:eastAsia="pl-PL"/>
+              </w:rPr>
+              <w:t>4</w:t>
+            </w:r>
+            <w:r>
+              <w:rPr>
+                <w:rFonts w:ascii="Arial" w:eastAsia="Times New Roman" w:hAnsi="Arial" w:cs="Arial"/>
+                <w:b/>
+                <w:bCs/>
+                <w:color w:val="353F49"/>
+                <w:lang w:eastAsia="pl-PL"/>
+              </w:rPr>
+              <w:t>/2024</w:t>
             </w:r>
           </w:p>
         </w:tc>
@@ -544,7 +573,7 @@
               <w:spacing w:after="0" w:line="240" w:lineRule="auto"/>
               <w:ind w:left="100"/>
               <w:rPr>
-                <w:rFonts w:ascii="Times New Roman" w:eastAsia="Times New Roman" w:hAnsi="Times New Roman" w:cs="Times New Roman"/>
+                <w:rFonts w:ascii="Arial" w:eastAsia="Times New Roman" w:hAnsi="Arial" w:cs="Arial"/>
                 <w:sz w:val="24"/>
                 <w:szCs w:val="24"/>
                 <w:lang w:eastAsia="pl-PL"/>
@@ -591,7 +620,26 @@
                 <w:lang w:eastAsia="pl-PL"/>
               </w:rPr>
               <w:tab/>
-              <w:t>1.0</w:t>
+            </w:r>
+            <w:r>
+              <w:rPr>
+                <w:rFonts w:ascii="Arial" w:eastAsia="Times New Roman" w:hAnsi="Arial" w:cs="Arial"/>
+                <w:b/>
+                <w:bCs/>
+                <w:color w:val="353F49"/>
+                <w:lang w:eastAsia="pl-PL"/>
+              </w:rPr>
+              <w:t>1</w:t>
+            </w:r>
+            <w:r>
+              <w:rPr>
+                <w:rFonts w:ascii="Arial" w:eastAsia="Times New Roman" w:hAnsi="Arial" w:cs="Arial"/>
+                <w:b/>
+                <w:bCs/>
+                <w:color w:val="353F49"/>
+                <w:lang w:eastAsia="pl-PL"/>
+              </w:rPr>
+              <w:t>.0</w:t>
             </w:r>
           </w:p>
         </w:tc>
@@ -622,7 +670,7 @@
               <w:spacing w:after="0" w:line="240" w:lineRule="auto"/>
               <w:ind w:left="100"/>
               <w:rPr>
-                <w:rFonts w:ascii="Times New Roman" w:eastAsia="Times New Roman" w:hAnsi="Times New Roman" w:cs="Times New Roman"/>
+                <w:rFonts w:ascii="Arial" w:eastAsia="Times New Roman" w:hAnsi="Arial" w:cs="Arial"/>
                 <w:sz w:val="24"/>
                 <w:szCs w:val="24"/>
                 <w:lang w:eastAsia="pl-PL"/>
@@ -700,7 +748,7 @@
               <w:spacing w:after="0" w:line="240" w:lineRule="auto"/>
               <w:ind w:left="100"/>
               <w:rPr>
-                <w:rFonts w:ascii="Times New Roman" w:eastAsia="Times New Roman" w:hAnsi="Times New Roman" w:cs="Times New Roman"/>
+                <w:rFonts w:ascii="Arial" w:eastAsia="Times New Roman" w:hAnsi="Arial" w:cs="Arial"/>
                 <w:sz w:val="24"/>
                 <w:szCs w:val="24"/>
                 <w:lang w:eastAsia="pl-PL"/>
@@ -716,7 +764,6 @@
               </w:rPr>
               <w:t>Author                   </w:t>
             </w:r>
-            <w:proofErr w:type="gramStart"/>
             <w:r>
               <w:rPr>
                 <w:rFonts w:ascii="Arial" w:eastAsia="Times New Roman" w:hAnsi="Arial" w:cs="Arial"/>
@@ -725,29 +772,8 @@
                 <w:color w:val="353F49"/>
                 <w:lang w:eastAsia="pl-PL"/>
               </w:rPr>
-              <w:t xml:space="preserve"> </w:t>
+              <w:t xml:space="preserve">  :</w:t>
             </w:r>
-            <w:r>
-              <w:rPr>
-                <w:rFonts w:ascii="Arial" w:eastAsia="Times New Roman" w:hAnsi="Arial" w:cs="Arial"/>
-                <w:b/>
-                <w:bCs/>
-                <w:color w:val="353F49"/>
-                <w:lang w:eastAsia="pl-PL"/>
-              </w:rPr>
-              <w:t xml:space="preserve"> </w:t>
-            </w:r>
-            <w:r>
-              <w:rPr>
-                <w:rFonts w:ascii="Arial" w:eastAsia="Times New Roman" w:hAnsi="Arial" w:cs="Arial"/>
-                <w:b/>
-                <w:bCs/>
-                <w:color w:val="353F49"/>
-                <w:lang w:eastAsia="pl-PL"/>
-              </w:rPr>
-              <w:t>:</w:t>
-            </w:r>
-            <w:proofErr w:type="gramEnd"/>
             <w:r>
               <w:rPr>
                 <w:rFonts w:ascii="Arial" w:eastAsia="Times New Roman" w:hAnsi="Arial" w:cs="Arial"/>
@@ -777,7 +803,7 @@
       <w:pPr>
         <w:spacing w:after="240" w:line="240" w:lineRule="auto"/>
         <w:rPr>
-          <w:rFonts w:ascii="Times New Roman" w:eastAsia="Times New Roman" w:hAnsi="Times New Roman" w:cs="Times New Roman"/>
+          <w:rFonts w:ascii="Arial" w:eastAsia="Times New Roman" w:hAnsi="Arial" w:cs="Arial"/>
           <w:sz w:val="24"/>
           <w:szCs w:val="24"/>
           <w:lang w:eastAsia="pl-PL"/>
@@ -831,7 +857,7 @@
         <w:spacing w:before="240" w:after="40" w:line="240" w:lineRule="auto"/>
         <w:outlineLvl w:val="0"/>
         <w:rPr>
-          <w:rFonts w:ascii="Times New Roman" w:eastAsia="Times New Roman" w:hAnsi="Times New Roman" w:cs="Times New Roman"/>
+          <w:rFonts w:ascii="Arial" w:eastAsia="Times New Roman" w:hAnsi="Arial" w:cs="Arial"/>
           <w:b/>
           <w:bCs/>
           <w:kern w:val="36"/>
@@ -850,14 +876,25 @@
           <w:lang w:eastAsia="pl-PL"/>
         </w:rPr>
         <w:lastRenderedPageBreak/>
-        <w:t>Version history</w:t>
+        <w:t xml:space="preserve">Version </w:t>
+      </w:r>
+      <w:r>
+        <w:rPr>
+          <w:rFonts w:ascii="Arial" w:eastAsia="Times New Roman" w:hAnsi="Arial" w:cs="Arial"/>
+          <w:color w:val="000000"/>
+          <w:kern w:val="36"/>
+          <w:sz w:val="40"/>
+          <w:szCs w:val="40"/>
+          <w:lang w:eastAsia="pl-PL"/>
+        </w:rPr>
+        <w:t>History</w:t>
       </w:r>
     </w:p>
     <w:p>
       <w:pPr>
         <w:spacing w:after="0" w:line="240" w:lineRule="auto"/>
         <w:rPr>
-          <w:rFonts w:ascii="Times New Roman" w:eastAsia="Times New Roman" w:hAnsi="Times New Roman" w:cs="Times New Roman"/>
+          <w:rFonts w:ascii="Arial" w:eastAsia="Times New Roman" w:hAnsi="Arial" w:cs="Arial"/>
           <w:sz w:val="24"/>
           <w:szCs w:val="24"/>
           <w:lang w:eastAsia="pl-PL"/>
@@ -877,9 +914,9 @@
       </w:tblPr>
       <w:tblGrid>
         <w:gridCol w:w="1181"/>
-        <w:gridCol w:w="1394"/>
+        <w:gridCol w:w="1502"/>
         <w:gridCol w:w="1380"/>
-        <w:gridCol w:w="3943"/>
+        <w:gridCol w:w="3835"/>
         <w:gridCol w:w="1108"/>
       </w:tblGrid>
       <w:tr>
@@ -910,7 +947,7 @@
               <w:ind w:left="100"/>
               <w:jc w:val="center"/>
               <w:rPr>
-                <w:rFonts w:ascii="Times New Roman" w:eastAsia="Times New Roman" w:hAnsi="Times New Roman" w:cs="Times New Roman"/>
+                <w:rFonts w:ascii="Arial" w:eastAsia="Times New Roman" w:hAnsi="Arial" w:cs="Arial"/>
                 <w:sz w:val="24"/>
                 <w:szCs w:val="24"/>
                 <w:lang w:eastAsia="pl-PL"/>
@@ -954,7 +991,7 @@
               <w:ind w:left="100"/>
               <w:jc w:val="center"/>
               <w:rPr>
-                <w:rFonts w:ascii="Times New Roman" w:eastAsia="Times New Roman" w:hAnsi="Times New Roman" w:cs="Times New Roman"/>
+                <w:rFonts w:ascii="Arial" w:eastAsia="Times New Roman" w:hAnsi="Arial" w:cs="Arial"/>
                 <w:sz w:val="24"/>
                 <w:szCs w:val="24"/>
                 <w:lang w:eastAsia="pl-PL"/>
@@ -998,7 +1035,7 @@
               <w:ind w:left="100"/>
               <w:jc w:val="center"/>
               <w:rPr>
-                <w:rFonts w:ascii="Times New Roman" w:eastAsia="Times New Roman" w:hAnsi="Times New Roman" w:cs="Times New Roman"/>
+                <w:rFonts w:ascii="Arial" w:eastAsia="Times New Roman" w:hAnsi="Arial" w:cs="Arial"/>
                 <w:sz w:val="24"/>
                 <w:szCs w:val="24"/>
                 <w:lang w:eastAsia="pl-PL"/>
@@ -1042,7 +1079,7 @@
               <w:ind w:left="100"/>
               <w:jc w:val="center"/>
               <w:rPr>
-                <w:rFonts w:ascii="Times New Roman" w:eastAsia="Times New Roman" w:hAnsi="Times New Roman" w:cs="Times New Roman"/>
+                <w:rFonts w:ascii="Arial" w:eastAsia="Times New Roman" w:hAnsi="Arial" w:cs="Arial"/>
                 <w:sz w:val="24"/>
                 <w:szCs w:val="24"/>
                 <w:lang w:eastAsia="pl-PL"/>
@@ -1086,7 +1123,7 @@
               <w:ind w:left="100"/>
               <w:jc w:val="center"/>
               <w:rPr>
-                <w:rFonts w:ascii="Times New Roman" w:eastAsia="Times New Roman" w:hAnsi="Times New Roman" w:cs="Times New Roman"/>
+                <w:rFonts w:ascii="Arial" w:eastAsia="Times New Roman" w:hAnsi="Arial" w:cs="Arial"/>
                 <w:sz w:val="24"/>
                 <w:szCs w:val="24"/>
                 <w:lang w:eastAsia="pl-PL"/>
@@ -1134,7 +1171,7 @@
               <w:spacing w:before="240" w:after="0" w:line="240" w:lineRule="auto"/>
               <w:jc w:val="center"/>
               <w:rPr>
-                <w:rFonts w:ascii="Times New Roman" w:eastAsia="Times New Roman" w:hAnsi="Times New Roman" w:cs="Times New Roman"/>
+                <w:rFonts w:ascii="Arial" w:eastAsia="Times New Roman" w:hAnsi="Arial" w:cs="Arial"/>
                 <w:sz w:val="24"/>
                 <w:szCs w:val="24"/>
                 <w:lang w:eastAsia="pl-PL"/>
@@ -1176,7 +1213,7 @@
               <w:ind w:left="100"/>
               <w:jc w:val="center"/>
               <w:rPr>
-                <w:rFonts w:ascii="Times New Roman" w:eastAsia="Times New Roman" w:hAnsi="Times New Roman" w:cs="Times New Roman"/>
+                <w:rFonts w:ascii="Arial" w:eastAsia="Times New Roman" w:hAnsi="Arial" w:cs="Arial"/>
                 <w:sz w:val="24"/>
                 <w:szCs w:val="24"/>
                 <w:lang w:eastAsia="pl-PL"/>
@@ -1184,7 +1221,7 @@
             </w:pPr>
             <w:r>
               <w:rPr>
-                <w:rFonts w:ascii="Times New Roman" w:eastAsia="Times New Roman" w:hAnsi="Times New Roman" w:cs="Times New Roman"/>
+                <w:rFonts w:ascii="Arial" w:eastAsia="Times New Roman" w:hAnsi="Arial" w:cs="Arial"/>
                 <w:sz w:val="24"/>
                 <w:szCs w:val="24"/>
                 <w:lang w:eastAsia="pl-PL"/>
@@ -1228,7 +1265,7 @@
               <w:spacing w:after="0" w:line="240" w:lineRule="auto"/>
               <w:jc w:val="center"/>
               <w:rPr>
-                <w:rFonts w:ascii="Times New Roman" w:eastAsia="Times New Roman" w:hAnsi="Times New Roman" w:cs="Times New Roman"/>
+                <w:rFonts w:ascii="Arial" w:eastAsia="Times New Roman" w:hAnsi="Arial" w:cs="Arial"/>
                 <w:sz w:val="24"/>
                 <w:szCs w:val="24"/>
                 <w:lang w:eastAsia="pl-PL"/>
@@ -1268,7 +1305,7 @@
               <w:spacing w:after="0" w:line="240" w:lineRule="auto"/>
               <w:jc w:val="center"/>
               <w:rPr>
-                <w:rFonts w:ascii="Times New Roman" w:eastAsia="Times New Roman" w:hAnsi="Times New Roman" w:cs="Times New Roman"/>
+                <w:rFonts w:ascii="Arial" w:eastAsia="Times New Roman" w:hAnsi="Arial" w:cs="Arial"/>
                 <w:sz w:val="24"/>
                 <w:szCs w:val="24"/>
                 <w:lang w:eastAsia="pl-PL"/>
@@ -1308,7 +1345,7 @@
               <w:spacing w:after="0" w:line="240" w:lineRule="auto"/>
               <w:jc w:val="center"/>
               <w:rPr>
-                <w:rFonts w:ascii="Times New Roman" w:eastAsia="Times New Roman" w:hAnsi="Times New Roman" w:cs="Times New Roman"/>
+                <w:rFonts w:ascii="Arial" w:eastAsia="Times New Roman" w:hAnsi="Arial" w:cs="Arial"/>
                 <w:sz w:val="24"/>
                 <w:szCs w:val="24"/>
                 <w:lang w:eastAsia="pl-PL"/>
@@ -1355,7 +1392,7 @@
               <w:ind w:left="100"/>
               <w:jc w:val="center"/>
               <w:rPr>
-                <w:rFonts w:ascii="Times New Roman" w:eastAsia="Times New Roman" w:hAnsi="Times New Roman" w:cs="Times New Roman"/>
+                <w:rFonts w:ascii="Arial" w:eastAsia="Times New Roman" w:hAnsi="Arial" w:cs="Arial"/>
                 <w:sz w:val="24"/>
                 <w:szCs w:val="24"/>
                 <w:lang w:eastAsia="pl-PL"/>
@@ -1397,7 +1434,7 @@
               <w:ind w:left="100"/>
               <w:jc w:val="center"/>
               <w:rPr>
-                <w:rFonts w:ascii="Times New Roman" w:eastAsia="Times New Roman" w:hAnsi="Times New Roman" w:cs="Times New Roman"/>
+                <w:rFonts w:ascii="Arial" w:eastAsia="Times New Roman" w:hAnsi="Arial" w:cs="Arial"/>
                 <w:sz w:val="24"/>
                 <w:szCs w:val="24"/>
                 <w:lang w:eastAsia="pl-PL"/>
@@ -1405,7 +1442,7 @@
             </w:pPr>
             <w:r>
               <w:rPr>
-                <w:rFonts w:ascii="Times New Roman" w:eastAsia="Times New Roman" w:hAnsi="Times New Roman" w:cs="Times New Roman"/>
+                <w:rFonts w:ascii="Arial" w:eastAsia="Times New Roman" w:hAnsi="Arial" w:cs="Arial"/>
                 <w:sz w:val="24"/>
                 <w:szCs w:val="24"/>
                 <w:lang w:eastAsia="pl-PL"/>
@@ -1451,7 +1488,7 @@
               <w:ind w:left="100"/>
               <w:jc w:val="center"/>
               <w:rPr>
-                <w:rFonts w:ascii="Times New Roman" w:eastAsia="Times New Roman" w:hAnsi="Times New Roman" w:cs="Times New Roman"/>
+                <w:rFonts w:ascii="Arial" w:eastAsia="Times New Roman" w:hAnsi="Arial" w:cs="Arial"/>
                 <w:sz w:val="24"/>
                 <w:szCs w:val="24"/>
                 <w:lang w:eastAsia="pl-PL"/>
@@ -1492,7 +1529,7 @@
               <w:ind w:left="100"/>
               <w:jc w:val="center"/>
               <w:rPr>
-                <w:rFonts w:ascii="Times New Roman" w:eastAsia="Times New Roman" w:hAnsi="Times New Roman" w:cs="Times New Roman"/>
+                <w:rFonts w:ascii="Arial" w:eastAsia="Times New Roman" w:hAnsi="Arial" w:cs="Arial"/>
                 <w:sz w:val="24"/>
                 <w:szCs w:val="24"/>
                 <w:lang w:eastAsia="pl-PL"/>
@@ -1532,7 +1569,7 @@
               <w:spacing w:after="0" w:line="240" w:lineRule="auto"/>
               <w:jc w:val="center"/>
               <w:rPr>
-                <w:rFonts w:ascii="Times New Roman" w:eastAsia="Times New Roman" w:hAnsi="Times New Roman" w:cs="Times New Roman"/>
+                <w:rFonts w:ascii="Arial" w:eastAsia="Times New Roman" w:hAnsi="Arial" w:cs="Arial"/>
                 <w:sz w:val="24"/>
                 <w:szCs w:val="24"/>
                 <w:lang w:eastAsia="pl-PL"/>
@@ -1556,7 +1593,7 @@
       <w:pPr>
         <w:spacing w:after="0" w:line="240" w:lineRule="auto"/>
         <w:rPr>
-          <w:rFonts w:ascii="Times New Roman" w:eastAsia="Times New Roman" w:hAnsi="Times New Roman" w:cs="Times New Roman"/>
+          <w:rFonts w:ascii="Arial" w:eastAsia="Times New Roman" w:hAnsi="Arial" w:cs="Arial"/>
           <w:sz w:val="24"/>
           <w:szCs w:val="24"/>
           <w:lang w:eastAsia="pl-PL"/>
@@ -1568,7 +1605,7 @@
         <w:spacing w:before="400" w:after="120" w:line="240" w:lineRule="auto"/>
         <w:outlineLvl w:val="0"/>
         <w:rPr>
-          <w:rFonts w:ascii="Times New Roman" w:eastAsia="Times New Roman" w:hAnsi="Times New Roman" w:cs="Times New Roman"/>
+          <w:rFonts w:ascii="Arial" w:eastAsia="Times New Roman" w:hAnsi="Arial" w:cs="Arial"/>
           <w:b/>
           <w:bCs/>
           <w:kern w:val="36"/>
@@ -1593,7 +1630,7 @@
       <w:pPr>
         <w:spacing w:after="0" w:line="240" w:lineRule="auto"/>
         <w:rPr>
-          <w:rFonts w:ascii="Times New Roman" w:eastAsia="Times New Roman" w:hAnsi="Times New Roman" w:cs="Times New Roman"/>
+          <w:rFonts w:ascii="Arial" w:eastAsia="Times New Roman" w:hAnsi="Arial" w:cs="Arial"/>
           <w:sz w:val="24"/>
           <w:szCs w:val="24"/>
           <w:lang w:eastAsia="pl-PL"/>
@@ -1621,8 +1658,8 @@
         <w:tblLook w:val="04A0" w:firstRow="1" w:lastRow="0" w:firstColumn="1" w:lastColumn="0" w:noHBand="0" w:noVBand="1"/>
       </w:tblPr>
       <w:tblGrid>
-        <w:gridCol w:w="812"/>
-        <w:gridCol w:w="2915"/>
+        <w:gridCol w:w="922"/>
+        <w:gridCol w:w="3649"/>
       </w:tblGrid>
       <w:tr>
         <w:tc>
@@ -1647,319 +1684,7 @@
               <w:spacing w:after="0" w:line="240" w:lineRule="auto"/>
               <w:jc w:val="center"/>
               <w:rPr>
-                <w:rFonts w:ascii="Times New Roman" w:eastAsia="Times New Roman" w:hAnsi="Times New Roman" w:cs="Times New Roman"/>
-                <w:sz w:val="24"/>
-                <w:szCs w:val="24"/>
-                <w:lang w:eastAsia="pl-PL"/>
-              </w:rPr>
-            </w:pPr>
-            <w:r>
-              <w:rPr>
                 <w:rFonts w:ascii="Arial" w:eastAsia="Times New Roman" w:hAnsi="Arial" w:cs="Arial"/>
-                <w:color w:val="000000"/>
-                <w:lang w:eastAsia="pl-PL"/>
-              </w:rPr>
-              <w:t>CSV</w:t>
-            </w:r>
-          </w:p>
-        </w:tc>
-        <w:tc>
-          <w:tcPr>
-            <w:tcW w:w="0" w:type="auto"/>
-            <w:tcBorders>
-              <w:top w:val="single" w:sz="8" w:space="0" w:color="000000"/>
-              <w:left w:val="single" w:sz="8" w:space="0" w:color="000000"/>
-              <w:bottom w:val="single" w:sz="8" w:space="0" w:color="000000"/>
-              <w:right w:val="single" w:sz="8" w:space="0" w:color="000000"/>
-            </w:tcBorders>
-            <w:tcMar>
-              <w:top w:w="100" w:type="dxa"/>
-              <w:left w:w="100" w:type="dxa"/>
-              <w:bottom w:w="100" w:type="dxa"/>
-              <w:right w:w="100" w:type="dxa"/>
-            </w:tcMar>
-            <w:hideMark/>
-          </w:tcPr>
-          <w:p>
-            <w:pPr>
-              <w:spacing w:after="0" w:line="240" w:lineRule="auto"/>
-              <w:jc w:val="center"/>
-              <w:rPr>
-                <w:rFonts w:ascii="Times New Roman" w:eastAsia="Times New Roman" w:hAnsi="Times New Roman" w:cs="Times New Roman"/>
-                <w:sz w:val="24"/>
-                <w:szCs w:val="24"/>
-                <w:lang w:eastAsia="pl-PL"/>
-              </w:rPr>
-            </w:pPr>
-            <w:r>
-              <w:rPr>
-                <w:rFonts w:ascii="Arial" w:eastAsia="Times New Roman" w:hAnsi="Arial" w:cs="Arial"/>
-                <w:color w:val="000000"/>
-                <w:lang w:eastAsia="pl-PL"/>
-              </w:rPr>
-              <w:t>Comma-Separated Values</w:t>
-            </w:r>
-          </w:p>
-        </w:tc>
-      </w:tr>
-      <w:tr>
-        <w:tc>
-          <w:tcPr>
-            <w:tcW w:w="0" w:type="auto"/>
-            <w:tcBorders>
-              <w:top w:val="single" w:sz="8" w:space="0" w:color="000000"/>
-              <w:left w:val="single" w:sz="8" w:space="0" w:color="000000"/>
-              <w:bottom w:val="single" w:sz="8" w:space="0" w:color="000000"/>
-              <w:right w:val="single" w:sz="8" w:space="0" w:color="000000"/>
-            </w:tcBorders>
-            <w:tcMar>
-              <w:top w:w="100" w:type="dxa"/>
-              <w:left w:w="100" w:type="dxa"/>
-              <w:bottom w:w="100" w:type="dxa"/>
-              <w:right w:w="100" w:type="dxa"/>
-            </w:tcMar>
-            <w:hideMark/>
-          </w:tcPr>
-          <w:p>
-            <w:pPr>
-              <w:spacing w:after="0" w:line="240" w:lineRule="auto"/>
-              <w:jc w:val="center"/>
-              <w:rPr>
-                <w:rFonts w:ascii="Times New Roman" w:eastAsia="Times New Roman" w:hAnsi="Times New Roman" w:cs="Times New Roman"/>
-                <w:sz w:val="24"/>
-                <w:szCs w:val="24"/>
-                <w:lang w:eastAsia="pl-PL"/>
-              </w:rPr>
-            </w:pPr>
-            <w:r>
-              <w:rPr>
-                <w:rFonts w:ascii="Arial" w:eastAsia="Times New Roman" w:hAnsi="Arial" w:cs="Arial"/>
-                <w:color w:val="000000"/>
-                <w:lang w:eastAsia="pl-PL"/>
-              </w:rPr>
-              <w:t>JSON</w:t>
-            </w:r>
-          </w:p>
-        </w:tc>
-        <w:tc>
-          <w:tcPr>
-            <w:tcW w:w="0" w:type="auto"/>
-            <w:tcBorders>
-              <w:top w:val="single" w:sz="8" w:space="0" w:color="000000"/>
-              <w:left w:val="single" w:sz="8" w:space="0" w:color="000000"/>
-              <w:bottom w:val="single" w:sz="8" w:space="0" w:color="000000"/>
-              <w:right w:val="single" w:sz="8" w:space="0" w:color="000000"/>
-            </w:tcBorders>
-            <w:tcMar>
-              <w:top w:w="100" w:type="dxa"/>
-              <w:left w:w="100" w:type="dxa"/>
-              <w:bottom w:w="100" w:type="dxa"/>
-              <w:right w:w="100" w:type="dxa"/>
-            </w:tcMar>
-            <w:hideMark/>
-          </w:tcPr>
-          <w:p>
-            <w:pPr>
-              <w:spacing w:after="0" w:line="240" w:lineRule="auto"/>
-              <w:jc w:val="center"/>
-              <w:rPr>
-                <w:rFonts w:ascii="Times New Roman" w:eastAsia="Times New Roman" w:hAnsi="Times New Roman" w:cs="Times New Roman"/>
-                <w:sz w:val="24"/>
-                <w:szCs w:val="24"/>
-                <w:lang w:eastAsia="pl-PL"/>
-              </w:rPr>
-            </w:pPr>
-            <w:r>
-              <w:rPr>
-                <w:rFonts w:ascii="Arial" w:eastAsia="Times New Roman" w:hAnsi="Arial" w:cs="Arial"/>
-                <w:color w:val="000000"/>
-                <w:lang w:eastAsia="pl-PL"/>
-              </w:rPr>
-              <w:t>JavaScript Object Notation</w:t>
-            </w:r>
-          </w:p>
-        </w:tc>
-      </w:tr>
-      <w:tr>
-        <w:tc>
-          <w:tcPr>
-            <w:tcW w:w="0" w:type="auto"/>
-            <w:tcBorders>
-              <w:top w:val="single" w:sz="8" w:space="0" w:color="000000"/>
-              <w:left w:val="single" w:sz="8" w:space="0" w:color="000000"/>
-              <w:bottom w:val="single" w:sz="8" w:space="0" w:color="000000"/>
-              <w:right w:val="single" w:sz="8" w:space="0" w:color="000000"/>
-            </w:tcBorders>
-            <w:tcMar>
-              <w:top w:w="100" w:type="dxa"/>
-              <w:left w:w="100" w:type="dxa"/>
-              <w:bottom w:w="100" w:type="dxa"/>
-              <w:right w:w="100" w:type="dxa"/>
-            </w:tcMar>
-            <w:hideMark/>
-          </w:tcPr>
-          <w:p>
-            <w:pPr>
-              <w:spacing w:after="0" w:line="240" w:lineRule="auto"/>
-              <w:jc w:val="center"/>
-              <w:rPr>
-                <w:rFonts w:ascii="Times New Roman" w:eastAsia="Times New Roman" w:hAnsi="Times New Roman" w:cs="Times New Roman"/>
-                <w:sz w:val="24"/>
-                <w:szCs w:val="24"/>
-                <w:lang w:eastAsia="pl-PL"/>
-              </w:rPr>
-            </w:pPr>
-            <w:r>
-              <w:rPr>
-                <w:rFonts w:ascii="Arial" w:eastAsia="Times New Roman" w:hAnsi="Arial" w:cs="Arial"/>
-                <w:color w:val="000000"/>
-                <w:lang w:eastAsia="pl-PL"/>
-              </w:rPr>
-              <w:t>KPIs</w:t>
-            </w:r>
-          </w:p>
-        </w:tc>
-        <w:tc>
-          <w:tcPr>
-            <w:tcW w:w="0" w:type="auto"/>
-            <w:tcBorders>
-              <w:top w:val="single" w:sz="8" w:space="0" w:color="000000"/>
-              <w:left w:val="single" w:sz="8" w:space="0" w:color="000000"/>
-              <w:bottom w:val="single" w:sz="8" w:space="0" w:color="000000"/>
-              <w:right w:val="single" w:sz="8" w:space="0" w:color="000000"/>
-            </w:tcBorders>
-            <w:tcMar>
-              <w:top w:w="100" w:type="dxa"/>
-              <w:left w:w="100" w:type="dxa"/>
-              <w:bottom w:w="100" w:type="dxa"/>
-              <w:right w:w="100" w:type="dxa"/>
-            </w:tcMar>
-            <w:hideMark/>
-          </w:tcPr>
-          <w:p>
-            <w:pPr>
-              <w:spacing w:after="0" w:line="240" w:lineRule="auto"/>
-              <w:jc w:val="center"/>
-              <w:rPr>
-                <w:rFonts w:ascii="Times New Roman" w:eastAsia="Times New Roman" w:hAnsi="Times New Roman" w:cs="Times New Roman"/>
-                <w:sz w:val="24"/>
-                <w:szCs w:val="24"/>
-                <w:lang w:eastAsia="pl-PL"/>
-              </w:rPr>
-            </w:pPr>
-            <w:r>
-              <w:rPr>
-                <w:rFonts w:ascii="Arial" w:eastAsia="Times New Roman" w:hAnsi="Arial" w:cs="Arial"/>
-                <w:color w:val="000000"/>
-                <w:lang w:eastAsia="pl-PL"/>
-              </w:rPr>
-              <w:t>Key Performance Indicators</w:t>
-            </w:r>
-          </w:p>
-        </w:tc>
-      </w:tr>
-      <w:tr>
-        <w:tc>
-          <w:tcPr>
-            <w:tcW w:w="0" w:type="auto"/>
-            <w:tcBorders>
-              <w:top w:val="single" w:sz="8" w:space="0" w:color="000000"/>
-              <w:left w:val="single" w:sz="8" w:space="0" w:color="000000"/>
-              <w:bottom w:val="single" w:sz="8" w:space="0" w:color="000000"/>
-              <w:right w:val="single" w:sz="8" w:space="0" w:color="000000"/>
-            </w:tcBorders>
-            <w:tcMar>
-              <w:top w:w="100" w:type="dxa"/>
-              <w:left w:w="100" w:type="dxa"/>
-              <w:bottom w:w="100" w:type="dxa"/>
-              <w:right w:w="100" w:type="dxa"/>
-            </w:tcMar>
-            <w:hideMark/>
-          </w:tcPr>
-          <w:p>
-            <w:pPr>
-              <w:spacing w:after="0" w:line="240" w:lineRule="auto"/>
-              <w:jc w:val="center"/>
-              <w:rPr>
-                <w:rFonts w:ascii="Times New Roman" w:eastAsia="Times New Roman" w:hAnsi="Times New Roman" w:cs="Times New Roman"/>
-                <w:sz w:val="24"/>
-                <w:szCs w:val="24"/>
-                <w:lang w:eastAsia="pl-PL"/>
-              </w:rPr>
-            </w:pPr>
-            <w:r>
-              <w:rPr>
-                <w:rFonts w:ascii="Arial" w:eastAsia="Times New Roman" w:hAnsi="Arial" w:cs="Arial"/>
-                <w:color w:val="000000"/>
-                <w:lang w:eastAsia="pl-PL"/>
-              </w:rPr>
-              <w:t>PDF</w:t>
-            </w:r>
-          </w:p>
-        </w:tc>
-        <w:tc>
-          <w:tcPr>
-            <w:tcW w:w="0" w:type="auto"/>
-            <w:tcBorders>
-              <w:top w:val="single" w:sz="8" w:space="0" w:color="000000"/>
-              <w:left w:val="single" w:sz="8" w:space="0" w:color="000000"/>
-              <w:bottom w:val="single" w:sz="8" w:space="0" w:color="000000"/>
-              <w:right w:val="single" w:sz="8" w:space="0" w:color="000000"/>
-            </w:tcBorders>
-            <w:tcMar>
-              <w:top w:w="100" w:type="dxa"/>
-              <w:left w:w="100" w:type="dxa"/>
-              <w:bottom w:w="100" w:type="dxa"/>
-              <w:right w:w="100" w:type="dxa"/>
-            </w:tcMar>
-            <w:hideMark/>
-          </w:tcPr>
-          <w:p>
-            <w:pPr>
-              <w:spacing w:after="0" w:line="240" w:lineRule="auto"/>
-              <w:jc w:val="center"/>
-              <w:rPr>
-                <w:rFonts w:ascii="Times New Roman" w:eastAsia="Times New Roman" w:hAnsi="Times New Roman" w:cs="Times New Roman"/>
-                <w:sz w:val="24"/>
-                <w:szCs w:val="24"/>
-                <w:lang w:eastAsia="pl-PL"/>
-              </w:rPr>
-            </w:pPr>
-            <w:r>
-              <w:rPr>
-                <w:rFonts w:ascii="Arial" w:eastAsia="Times New Roman" w:hAnsi="Arial" w:cs="Arial"/>
-                <w:color w:val="000000"/>
-                <w:lang w:eastAsia="pl-PL"/>
-              </w:rPr>
-              <w:t>Portable Document Format</w:t>
-            </w:r>
-          </w:p>
-        </w:tc>
-      </w:tr>
-      <w:tr>
-        <w:tc>
-          <w:tcPr>
-            <w:tcW w:w="0" w:type="auto"/>
-            <w:tcBorders>
-              <w:top w:val="single" w:sz="8" w:space="0" w:color="000000"/>
-              <w:left w:val="single" w:sz="8" w:space="0" w:color="000000"/>
-              <w:bottom w:val="single" w:sz="8" w:space="0" w:color="000000"/>
-              <w:right w:val="single" w:sz="8" w:space="0" w:color="000000"/>
-            </w:tcBorders>
-            <w:tcMar>
-              <w:top w:w="100" w:type="dxa"/>
-              <w:left w:w="100" w:type="dxa"/>
-              <w:bottom w:w="100" w:type="dxa"/>
-              <w:right w:w="100" w:type="dxa"/>
-            </w:tcMar>
-            <w:hideMark/>
-          </w:tcPr>
-          <w:p>
-            <w:pPr>
-              <w:spacing w:after="0" w:line="240" w:lineRule="auto"/>
-              <w:jc w:val="center"/>
-              <w:rPr>
-                <w:rFonts w:ascii="Times New Roman" w:eastAsia="Times New Roman" w:hAnsi="Times New Roman" w:cs="Times New Roman"/>
                 <w:sz w:val="24"/>
                 <w:szCs w:val="24"/>
                 <w:lang w:eastAsia="pl-PL"/>
@@ -1997,7 +1722,7 @@
               <w:spacing w:after="0" w:line="240" w:lineRule="auto"/>
               <w:jc w:val="center"/>
               <w:rPr>
-                <w:rFonts w:ascii="Times New Roman" w:eastAsia="Times New Roman" w:hAnsi="Times New Roman" w:cs="Times New Roman"/>
+                <w:rFonts w:ascii="Arial" w:eastAsia="Times New Roman" w:hAnsi="Arial" w:cs="Arial"/>
                 <w:sz w:val="24"/>
                 <w:szCs w:val="24"/>
                 <w:lang w:eastAsia="pl-PL"/>
@@ -2014,12 +1739,234 @@
           </w:p>
         </w:tc>
       </w:tr>
+      <w:tr>
+        <w:tc>
+          <w:tcPr>
+            <w:tcW w:w="0" w:type="auto"/>
+            <w:tcBorders>
+              <w:top w:val="single" w:sz="8" w:space="0" w:color="000000"/>
+              <w:left w:val="single" w:sz="8" w:space="0" w:color="000000"/>
+              <w:bottom w:val="single" w:sz="8" w:space="0" w:color="000000"/>
+              <w:right w:val="single" w:sz="8" w:space="0" w:color="000000"/>
+            </w:tcBorders>
+            <w:tcMar>
+              <w:top w:w="100" w:type="dxa"/>
+              <w:left w:w="100" w:type="dxa"/>
+              <w:bottom w:w="100" w:type="dxa"/>
+              <w:right w:w="100" w:type="dxa"/>
+            </w:tcMar>
+          </w:tcPr>
+          <w:p>
+            <w:pPr>
+              <w:spacing w:after="0" w:line="240" w:lineRule="auto"/>
+              <w:jc w:val="center"/>
+              <w:rPr>
+                <w:rFonts w:ascii="Arial" w:eastAsia="Times New Roman" w:hAnsi="Arial" w:cs="Arial"/>
+                <w:color w:val="000000"/>
+                <w:lang w:eastAsia="pl-PL"/>
+              </w:rPr>
+            </w:pPr>
+            <w:r>
+              <w:rPr>
+                <w:rFonts w:ascii="Arial" w:eastAsia="Times New Roman" w:hAnsi="Arial" w:cs="Arial"/>
+                <w:color w:val="000000"/>
+                <w:lang w:eastAsia="pl-PL"/>
+              </w:rPr>
+              <w:t>URS</w:t>
+            </w:r>
+          </w:p>
+        </w:tc>
+        <w:tc>
+          <w:tcPr>
+            <w:tcW w:w="0" w:type="auto"/>
+            <w:tcBorders>
+              <w:top w:val="single" w:sz="8" w:space="0" w:color="000000"/>
+              <w:left w:val="single" w:sz="8" w:space="0" w:color="000000"/>
+              <w:bottom w:val="single" w:sz="8" w:space="0" w:color="000000"/>
+              <w:right w:val="single" w:sz="8" w:space="0" w:color="000000"/>
+            </w:tcBorders>
+            <w:tcMar>
+              <w:top w:w="100" w:type="dxa"/>
+              <w:left w:w="100" w:type="dxa"/>
+              <w:bottom w:w="100" w:type="dxa"/>
+              <w:right w:w="100" w:type="dxa"/>
+            </w:tcMar>
+          </w:tcPr>
+          <w:p>
+            <w:pPr>
+              <w:spacing w:after="0" w:line="240" w:lineRule="auto"/>
+              <w:jc w:val="center"/>
+              <w:rPr>
+                <w:rFonts w:ascii="Arial" w:eastAsia="Times New Roman" w:hAnsi="Arial" w:cs="Arial"/>
+                <w:color w:val="000000"/>
+                <w:lang w:eastAsia="pl-PL"/>
+              </w:rPr>
+            </w:pPr>
+            <w:r>
+              <w:rPr>
+                <w:rFonts w:ascii="Arial" w:eastAsia="Times New Roman" w:hAnsi="Arial" w:cs="Arial"/>
+                <w:color w:val="000000"/>
+                <w:lang w:eastAsia="pl-PL"/>
+              </w:rPr>
+              <w:t>User Requirements Specification</w:t>
+            </w:r>
+          </w:p>
+        </w:tc>
+      </w:tr>
+      <w:tr>
+        <w:tc>
+          <w:tcPr>
+            <w:tcW w:w="0" w:type="auto"/>
+            <w:tcBorders>
+              <w:top w:val="single" w:sz="8" w:space="0" w:color="000000"/>
+              <w:left w:val="single" w:sz="8" w:space="0" w:color="000000"/>
+              <w:bottom w:val="single" w:sz="8" w:space="0" w:color="000000"/>
+              <w:right w:val="single" w:sz="8" w:space="0" w:color="000000"/>
+            </w:tcBorders>
+            <w:tcMar>
+              <w:top w:w="100" w:type="dxa"/>
+              <w:left w:w="100" w:type="dxa"/>
+              <w:bottom w:w="100" w:type="dxa"/>
+              <w:right w:w="100" w:type="dxa"/>
+            </w:tcMar>
+          </w:tcPr>
+          <w:p>
+            <w:pPr>
+              <w:spacing w:after="0" w:line="240" w:lineRule="auto"/>
+              <w:jc w:val="center"/>
+              <w:rPr>
+                <w:rFonts w:ascii="Arial" w:eastAsia="Times New Roman" w:hAnsi="Arial" w:cs="Arial"/>
+                <w:color w:val="000000"/>
+                <w:lang w:eastAsia="pl-PL"/>
+              </w:rPr>
+            </w:pPr>
+            <w:r>
+              <w:rPr>
+                <w:rFonts w:ascii="Arial" w:eastAsia="Times New Roman" w:hAnsi="Arial" w:cs="Arial"/>
+                <w:color w:val="000000"/>
+                <w:lang w:eastAsia="pl-PL"/>
+              </w:rPr>
+              <w:t>CRUD</w:t>
+            </w:r>
+          </w:p>
+        </w:tc>
+        <w:tc>
+          <w:tcPr>
+            <w:tcW w:w="0" w:type="auto"/>
+            <w:tcBorders>
+              <w:top w:val="single" w:sz="8" w:space="0" w:color="000000"/>
+              <w:left w:val="single" w:sz="8" w:space="0" w:color="000000"/>
+              <w:bottom w:val="single" w:sz="8" w:space="0" w:color="000000"/>
+              <w:right w:val="single" w:sz="8" w:space="0" w:color="000000"/>
+            </w:tcBorders>
+            <w:tcMar>
+              <w:top w:w="100" w:type="dxa"/>
+              <w:left w:w="100" w:type="dxa"/>
+              <w:bottom w:w="100" w:type="dxa"/>
+              <w:right w:w="100" w:type="dxa"/>
+            </w:tcMar>
+          </w:tcPr>
+          <w:p>
+            <w:pPr>
+              <w:spacing w:after="0" w:line="240" w:lineRule="auto"/>
+              <w:jc w:val="center"/>
+              <w:rPr>
+                <w:rFonts w:ascii="Arial" w:eastAsia="Times New Roman" w:hAnsi="Arial" w:cs="Arial"/>
+                <w:color w:val="000000"/>
+                <w:lang w:eastAsia="pl-PL"/>
+              </w:rPr>
+            </w:pPr>
+            <w:r>
+              <w:rPr>
+                <w:rFonts w:ascii="Arial" w:eastAsia="Times New Roman" w:hAnsi="Arial" w:cs="Arial"/>
+                <w:color w:val="000000"/>
+                <w:lang w:eastAsia="pl-PL"/>
+              </w:rPr>
+              <w:t>Create Read Update Delete</w:t>
+            </w:r>
+          </w:p>
+        </w:tc>
+      </w:tr>
+      <w:tr>
+        <w:tc>
+          <w:tcPr>
+            <w:tcW w:w="0" w:type="auto"/>
+            <w:tcBorders>
+              <w:top w:val="single" w:sz="8" w:space="0" w:color="000000"/>
+              <w:left w:val="single" w:sz="8" w:space="0" w:color="000000"/>
+              <w:bottom w:val="single" w:sz="8" w:space="0" w:color="000000"/>
+              <w:right w:val="single" w:sz="8" w:space="0" w:color="000000"/>
+            </w:tcBorders>
+            <w:tcMar>
+              <w:top w:w="100" w:type="dxa"/>
+              <w:left w:w="100" w:type="dxa"/>
+              <w:bottom w:w="100" w:type="dxa"/>
+              <w:right w:w="100" w:type="dxa"/>
+            </w:tcMar>
+          </w:tcPr>
+          <w:p>
+            <w:pPr>
+              <w:spacing w:after="0" w:line="240" w:lineRule="auto"/>
+              <w:jc w:val="center"/>
+              <w:rPr>
+                <w:rFonts w:ascii="Arial" w:eastAsia="Times New Roman" w:hAnsi="Arial" w:cs="Arial"/>
+                <w:color w:val="000000"/>
+                <w:lang w:eastAsia="pl-PL"/>
+              </w:rPr>
+            </w:pPr>
+            <w:r>
+              <w:rPr>
+                <w:rFonts w:ascii="Arial" w:eastAsia="Times New Roman" w:hAnsi="Arial" w:cs="Arial"/>
+                <w:color w:val="000000"/>
+                <w:lang w:eastAsia="pl-PL"/>
+              </w:rPr>
+              <w:t>HTTPS</w:t>
+            </w:r>
+          </w:p>
+        </w:tc>
+        <w:tc>
+          <w:tcPr>
+            <w:tcW w:w="0" w:type="auto"/>
+            <w:tcBorders>
+              <w:top w:val="single" w:sz="8" w:space="0" w:color="000000"/>
+              <w:left w:val="single" w:sz="8" w:space="0" w:color="000000"/>
+              <w:bottom w:val="single" w:sz="8" w:space="0" w:color="000000"/>
+              <w:right w:val="single" w:sz="8" w:space="0" w:color="000000"/>
+            </w:tcBorders>
+            <w:tcMar>
+              <w:top w:w="100" w:type="dxa"/>
+              <w:left w:w="100" w:type="dxa"/>
+              <w:bottom w:w="100" w:type="dxa"/>
+              <w:right w:w="100" w:type="dxa"/>
+            </w:tcMar>
+          </w:tcPr>
+          <w:p>
+            <w:pPr>
+              <w:spacing w:after="0" w:line="240" w:lineRule="auto"/>
+              <w:jc w:val="center"/>
+              <w:rPr>
+                <w:rFonts w:ascii="Arial" w:eastAsia="Times New Roman" w:hAnsi="Arial" w:cs="Arial"/>
+                <w:color w:val="000000"/>
+                <w:lang w:eastAsia="pl-PL"/>
+              </w:rPr>
+            </w:pPr>
+            <w:r>
+              <w:rPr>
+                <w:rFonts w:ascii="Arial" w:eastAsia="Times New Roman" w:hAnsi="Arial" w:cs="Arial"/>
+                <w:color w:val="000000"/>
+                <w:lang w:eastAsia="pl-PL"/>
+              </w:rPr>
+              <w:t>Hypertext Transfer Protocol Secure</w:t>
+            </w:r>
+          </w:p>
+        </w:tc>
+      </w:tr>
     </w:tbl>
     <w:p>
       <w:pPr>
         <w:spacing w:after="240" w:line="240" w:lineRule="auto"/>
         <w:rPr>
-          <w:rFonts w:ascii="Times New Roman" w:eastAsia="Times New Roman" w:hAnsi="Times New Roman" w:cs="Times New Roman"/>
+          <w:rFonts w:ascii="Arial" w:eastAsia="Times New Roman" w:hAnsi="Arial" w:cs="Arial"/>
           <w:sz w:val="24"/>
           <w:szCs w:val="24"/>
           <w:lang w:eastAsia="pl-PL"/>
@@ -2030,7 +1977,7 @@
       <w:pPr>
         <w:spacing w:after="240" w:line="240" w:lineRule="auto"/>
         <w:rPr>
-          <w:rFonts w:ascii="Times New Roman" w:eastAsia="Times New Roman" w:hAnsi="Times New Roman" w:cs="Times New Roman"/>
+          <w:rFonts w:ascii="Arial" w:eastAsia="Times New Roman" w:hAnsi="Arial" w:cs="Arial"/>
           <w:sz w:val="24"/>
           <w:szCs w:val="24"/>
           <w:lang w:eastAsia="pl-PL"/>
@@ -2038,7 +1985,7 @@
       </w:pPr>
       <w:r>
         <w:rPr>
-          <w:rFonts w:ascii="Times New Roman" w:eastAsia="Times New Roman" w:hAnsi="Times New Roman" w:cs="Times New Roman"/>
+          <w:rFonts w:ascii="Arial" w:eastAsia="Times New Roman" w:hAnsi="Arial" w:cs="Arial"/>
           <w:sz w:val="24"/>
           <w:szCs w:val="24"/>
           <w:lang w:eastAsia="pl-PL"/>
@@ -2047,7 +1994,7 @@
       </w:r>
       <w:r>
         <w:rPr>
-          <w:rFonts w:ascii="Times New Roman" w:eastAsia="Times New Roman" w:hAnsi="Times New Roman" w:cs="Times New Roman"/>
+          <w:rFonts w:ascii="Arial" w:eastAsia="Times New Roman" w:hAnsi="Arial" w:cs="Arial"/>
           <w:sz w:val="24"/>
           <w:szCs w:val="24"/>
           <w:lang w:eastAsia="pl-PL"/>
@@ -2056,7 +2003,7 @@
       </w:r>
       <w:r>
         <w:rPr>
-          <w:rFonts w:ascii="Times New Roman" w:eastAsia="Times New Roman" w:hAnsi="Times New Roman" w:cs="Times New Roman"/>
+          <w:rFonts w:ascii="Arial" w:eastAsia="Times New Roman" w:hAnsi="Arial" w:cs="Arial"/>
           <w:sz w:val="24"/>
           <w:szCs w:val="24"/>
           <w:lang w:eastAsia="pl-PL"/>
@@ -2065,7 +2012,7 @@
       </w:r>
       <w:r>
         <w:rPr>
-          <w:rFonts w:ascii="Times New Roman" w:eastAsia="Times New Roman" w:hAnsi="Times New Roman" w:cs="Times New Roman"/>
+          <w:rFonts w:ascii="Arial" w:eastAsia="Times New Roman" w:hAnsi="Arial" w:cs="Arial"/>
           <w:sz w:val="24"/>
           <w:szCs w:val="24"/>
           <w:lang w:eastAsia="pl-PL"/>
@@ -2074,7 +2021,7 @@
       </w:r>
       <w:r>
         <w:rPr>
-          <w:rFonts w:ascii="Times New Roman" w:eastAsia="Times New Roman" w:hAnsi="Times New Roman" w:cs="Times New Roman"/>
+          <w:rFonts w:ascii="Arial" w:eastAsia="Times New Roman" w:hAnsi="Arial" w:cs="Arial"/>
           <w:sz w:val="24"/>
           <w:szCs w:val="24"/>
           <w:lang w:eastAsia="pl-PL"/>
@@ -2083,7 +2030,7 @@
       </w:r>
       <w:r>
         <w:rPr>
-          <w:rFonts w:ascii="Times New Roman" w:eastAsia="Times New Roman" w:hAnsi="Times New Roman" w:cs="Times New Roman"/>
+          <w:rFonts w:ascii="Arial" w:eastAsia="Times New Roman" w:hAnsi="Arial" w:cs="Arial"/>
           <w:sz w:val="24"/>
           <w:szCs w:val="24"/>
           <w:lang w:eastAsia="pl-PL"/>
@@ -2092,7 +2039,7 @@
       </w:r>
       <w:r>
         <w:rPr>
-          <w:rFonts w:ascii="Times New Roman" w:eastAsia="Times New Roman" w:hAnsi="Times New Roman" w:cs="Times New Roman"/>
+          <w:rFonts w:ascii="Arial" w:eastAsia="Times New Roman" w:hAnsi="Arial" w:cs="Arial"/>
           <w:sz w:val="24"/>
           <w:szCs w:val="24"/>
           <w:lang w:eastAsia="pl-PL"/>
@@ -2101,7 +2048,7 @@
       </w:r>
       <w:r>
         <w:rPr>
-          <w:rFonts w:ascii="Times New Roman" w:eastAsia="Times New Roman" w:hAnsi="Times New Roman" w:cs="Times New Roman"/>
+          <w:rFonts w:ascii="Arial" w:eastAsia="Times New Roman" w:hAnsi="Arial" w:cs="Arial"/>
           <w:sz w:val="24"/>
           <w:szCs w:val="24"/>
           <w:lang w:eastAsia="pl-PL"/>
@@ -2128,7 +2075,7 @@
         <w:spacing w:before="400" w:after="120" w:line="240" w:lineRule="auto"/>
         <w:outlineLvl w:val="0"/>
         <w:rPr>
-          <w:rFonts w:ascii="Times New Roman" w:eastAsia="Times New Roman" w:hAnsi="Times New Roman" w:cs="Times New Roman"/>
+          <w:rFonts w:ascii="Arial" w:eastAsia="Times New Roman" w:hAnsi="Arial" w:cs="Arial"/>
           <w:b/>
           <w:bCs/>
           <w:kern w:val="36"/>
@@ -2152,8 +2099,9 @@
     <w:p>
       <w:pPr>
         <w:spacing w:after="0" w:line="240" w:lineRule="auto"/>
-        <w:rPr>
-          <w:rFonts w:ascii="Times New Roman" w:eastAsia="Times New Roman" w:hAnsi="Times New Roman" w:cs="Times New Roman"/>
+        <w:ind w:firstLine="708"/>
+        <w:rPr>
+          <w:rFonts w:ascii="Arial" w:eastAsia="Times New Roman" w:hAnsi="Arial" w:cs="Arial"/>
           <w:sz w:val="24"/>
           <w:szCs w:val="24"/>
           <w:lang w:eastAsia="pl-PL"/>
@@ -2196,7 +2144,7 @@
       <w:pPr>
         <w:spacing w:after="0" w:line="240" w:lineRule="auto"/>
         <w:rPr>
-          <w:rFonts w:ascii="Times New Roman" w:eastAsia="Times New Roman" w:hAnsi="Times New Roman" w:cs="Times New Roman"/>
+          <w:rFonts w:ascii="Arial" w:eastAsia="Times New Roman" w:hAnsi="Arial" w:cs="Arial"/>
           <w:sz w:val="24"/>
           <w:szCs w:val="24"/>
           <w:lang w:eastAsia="pl-PL"/>
@@ -2208,7 +2156,77 @@
         <w:spacing w:before="400" w:after="120" w:line="240" w:lineRule="auto"/>
         <w:outlineLvl w:val="0"/>
         <w:rPr>
-          <w:rFonts w:ascii="Times New Roman" w:eastAsia="Times New Roman" w:hAnsi="Times New Roman" w:cs="Times New Roman"/>
+          <w:rFonts w:ascii="Arial" w:eastAsia="Times New Roman" w:hAnsi="Arial" w:cs="Arial"/>
+          <w:color w:val="000000"/>
+          <w:kern w:val="36"/>
+          <w:sz w:val="40"/>
+          <w:szCs w:val="40"/>
+          <w:lang w:eastAsia="pl-PL"/>
+        </w:rPr>
+      </w:pPr>
+    </w:p>
+    <w:p>
+      <w:pPr>
+        <w:spacing w:before="400" w:after="120" w:line="240" w:lineRule="auto"/>
+        <w:outlineLvl w:val="0"/>
+        <w:rPr>
+          <w:rFonts w:ascii="Arial" w:eastAsia="Times New Roman" w:hAnsi="Arial" w:cs="Arial"/>
+          <w:color w:val="000000"/>
+          <w:kern w:val="36"/>
+          <w:sz w:val="40"/>
+          <w:szCs w:val="40"/>
+          <w:lang w:eastAsia="pl-PL"/>
+        </w:rPr>
+      </w:pPr>
+    </w:p>
+    <w:p>
+      <w:pPr>
+        <w:spacing w:before="400" w:after="120" w:line="240" w:lineRule="auto"/>
+        <w:outlineLvl w:val="0"/>
+        <w:rPr>
+          <w:rFonts w:ascii="Arial" w:eastAsia="Times New Roman" w:hAnsi="Arial" w:cs="Arial"/>
+          <w:color w:val="000000"/>
+          <w:kern w:val="36"/>
+          <w:sz w:val="40"/>
+          <w:szCs w:val="40"/>
+          <w:lang w:eastAsia="pl-PL"/>
+        </w:rPr>
+      </w:pPr>
+    </w:p>
+    <w:p>
+      <w:pPr>
+        <w:spacing w:before="400" w:after="120" w:line="240" w:lineRule="auto"/>
+        <w:outlineLvl w:val="0"/>
+        <w:rPr>
+          <w:rFonts w:ascii="Arial" w:eastAsia="Times New Roman" w:hAnsi="Arial" w:cs="Arial"/>
+          <w:color w:val="000000"/>
+          <w:kern w:val="36"/>
+          <w:sz w:val="40"/>
+          <w:szCs w:val="40"/>
+          <w:lang w:eastAsia="pl-PL"/>
+        </w:rPr>
+      </w:pPr>
+    </w:p>
+    <w:p>
+      <w:pPr>
+        <w:spacing w:before="400" w:after="120" w:line="240" w:lineRule="auto"/>
+        <w:outlineLvl w:val="0"/>
+        <w:rPr>
+          <w:rFonts w:ascii="Arial" w:eastAsia="Times New Roman" w:hAnsi="Arial" w:cs="Arial"/>
+          <w:color w:val="000000"/>
+          <w:kern w:val="36"/>
+          <w:sz w:val="40"/>
+          <w:szCs w:val="40"/>
+          <w:lang w:eastAsia="pl-PL"/>
+        </w:rPr>
+      </w:pPr>
+    </w:p>
+    <w:p>
+      <w:pPr>
+        <w:spacing w:before="400" w:after="120" w:line="240" w:lineRule="auto"/>
+        <w:outlineLvl w:val="0"/>
+        <w:rPr>
+          <w:rFonts w:ascii="Arial" w:eastAsia="Times New Roman" w:hAnsi="Arial" w:cs="Arial"/>
           <w:b/>
           <w:bCs/>
           <w:kern w:val="36"/>
@@ -2226,6 +2244,7 @@
           <w:szCs w:val="40"/>
           <w:lang w:eastAsia="pl-PL"/>
         </w:rPr>
+        <w:lastRenderedPageBreak/>
         <w:t>Functional Requirements</w:t>
       </w:r>
     </w:p>
@@ -2234,7 +2253,7 @@
         <w:spacing w:before="360" w:after="120" w:line="240" w:lineRule="auto"/>
         <w:outlineLvl w:val="1"/>
         <w:rPr>
-          <w:rFonts w:ascii="Times New Roman" w:eastAsia="Times New Roman" w:hAnsi="Times New Roman" w:cs="Times New Roman"/>
+          <w:rFonts w:ascii="Arial" w:eastAsia="Times New Roman" w:hAnsi="Arial" w:cs="Arial"/>
           <w:b/>
           <w:bCs/>
           <w:sz w:val="36"/>
@@ -2262,6 +2281,18 @@
         </w:rPr>
         <w:t>User Profiles and Interactions</w:t>
       </w:r>
+    </w:p>
+    <w:p>
+      <w:pPr>
+        <w:spacing w:after="0" w:line="240" w:lineRule="auto"/>
+        <w:ind w:left="1440"/>
+        <w:textAlignment w:val="baseline"/>
+        <w:rPr>
+          <w:rFonts w:ascii="Arial" w:eastAsia="Times New Roman" w:hAnsi="Arial" w:cs="Arial"/>
+          <w:color w:val="000000"/>
+          <w:lang w:eastAsia="pl-PL"/>
+        </w:rPr>
+      </w:pPr>
     </w:p>
     <w:p>
       <w:pPr>
@@ -2340,7 +2371,23 @@
           <w:color w:val="000000"/>
           <w:lang w:eastAsia="pl-PL"/>
         </w:rPr>
-        <w:t xml:space="preserve">Users shall be able to select their </w:t>
+        <w:t xml:space="preserve">Users </w:t>
+      </w:r>
+      <w:r>
+        <w:rPr>
+          <w:rFonts w:ascii="Arial" w:eastAsia="Times New Roman" w:hAnsi="Arial" w:cs="Arial"/>
+          <w:color w:val="000000"/>
+          <w:lang w:eastAsia="pl-PL"/>
+        </w:rPr>
+        <w:t>will</w:t>
+      </w:r>
+      <w:r>
+        <w:rPr>
+          <w:rFonts w:ascii="Arial" w:eastAsia="Times New Roman" w:hAnsi="Arial" w:cs="Arial"/>
+          <w:color w:val="000000"/>
+          <w:lang w:eastAsia="pl-PL"/>
+        </w:rPr>
+        <w:t xml:space="preserve"> be able to select their </w:t>
       </w:r>
       <w:r>
         <w:rPr>
@@ -2380,7 +2427,23 @@
           <w:color w:val="000000"/>
           <w:lang w:eastAsia="pl-PL"/>
         </w:rPr>
-        <w:t>Users shall be able to interact with each other by liking, commenting, and reporting comments on reviews.</w:t>
+        <w:t xml:space="preserve">Users </w:t>
+      </w:r>
+      <w:r>
+        <w:rPr>
+          <w:rFonts w:ascii="Arial" w:eastAsia="Times New Roman" w:hAnsi="Arial" w:cs="Arial"/>
+          <w:color w:val="000000"/>
+          <w:lang w:eastAsia="pl-PL"/>
+        </w:rPr>
+        <w:t>will</w:t>
+      </w:r>
+      <w:r>
+        <w:rPr>
+          <w:rFonts w:ascii="Arial" w:eastAsia="Times New Roman" w:hAnsi="Arial" w:cs="Arial"/>
+          <w:color w:val="000000"/>
+          <w:lang w:eastAsia="pl-PL"/>
+        </w:rPr>
+        <w:t xml:space="preserve"> be able to interact with each other by liking, commenting, and reporting comments on reviews.</w:t>
       </w:r>
     </w:p>
     <w:p>
@@ -2404,7 +2467,23 @@
           <w:color w:val="000000"/>
           <w:lang w:eastAsia="pl-PL"/>
         </w:rPr>
-        <w:t>Users shall have the option to receive music recommendations from other users, with mutual consent.</w:t>
+        <w:t xml:space="preserve">Users </w:t>
+      </w:r>
+      <w:r>
+        <w:rPr>
+          <w:rFonts w:ascii="Arial" w:eastAsia="Times New Roman" w:hAnsi="Arial" w:cs="Arial"/>
+          <w:color w:val="000000"/>
+          <w:lang w:eastAsia="pl-PL"/>
+        </w:rPr>
+        <w:t>will</w:t>
+      </w:r>
+      <w:r>
+        <w:rPr>
+          <w:rFonts w:ascii="Arial" w:eastAsia="Times New Roman" w:hAnsi="Arial" w:cs="Arial"/>
+          <w:color w:val="000000"/>
+          <w:lang w:eastAsia="pl-PL"/>
+        </w:rPr>
+        <w:t xml:space="preserve"> have the option to receive music recommendations from other users, with mutual consent.</w:t>
       </w:r>
     </w:p>
     <w:p>
@@ -2419,20 +2498,6 @@
           <w:lang w:eastAsia="pl-PL"/>
         </w:rPr>
       </w:pPr>
-    </w:p>
-    <w:p>
-      <w:pPr>
-        <w:spacing w:before="360" w:after="120" w:line="240" w:lineRule="auto"/>
-        <w:outlineLvl w:val="1"/>
-        <w:rPr>
-          <w:rFonts w:ascii="Times New Roman" w:eastAsia="Times New Roman" w:hAnsi="Times New Roman" w:cs="Times New Roman"/>
-          <w:b/>
-          <w:bCs/>
-          <w:sz w:val="36"/>
-          <w:szCs w:val="36"/>
-          <w:lang w:eastAsia="pl-PL"/>
-        </w:rPr>
-      </w:pPr>
       <w:r>
         <w:rPr>
           <w:rFonts w:ascii="Arial" w:eastAsia="Times New Roman" w:hAnsi="Arial" w:cs="Arial"/>
@@ -2441,7 +2506,6 @@
           <w:szCs w:val="32"/>
           <w:lang w:eastAsia="pl-PL"/>
         </w:rPr>
-        <w:lastRenderedPageBreak/>
         <w:t xml:space="preserve">FR.2 </w:t>
       </w:r>
       <w:r>
@@ -2454,6 +2518,18 @@
         </w:rPr>
         <w:t>Review System</w:t>
       </w:r>
+    </w:p>
+    <w:p>
+      <w:pPr>
+        <w:pStyle w:val="ListParagraph"/>
+        <w:spacing w:after="0" w:line="240" w:lineRule="auto"/>
+        <w:ind w:left="1428"/>
+        <w:rPr>
+          <w:rFonts w:ascii="Arial" w:eastAsia="Times New Roman" w:hAnsi="Arial" w:cs="Arial"/>
+          <w:color w:val="000000"/>
+          <w:lang w:eastAsia="pl-PL"/>
+        </w:rPr>
+      </w:pPr>
     </w:p>
     <w:p>
       <w:pPr>
@@ -2475,7 +2551,23 @@
           <w:color w:val="000000"/>
           <w:lang w:eastAsia="pl-PL"/>
         </w:rPr>
-        <w:t>Users shall be able to write and read reviews of songs, albums, and artists.</w:t>
+        <w:t xml:space="preserve">Users </w:t>
+      </w:r>
+      <w:r>
+        <w:rPr>
+          <w:rFonts w:ascii="Arial" w:eastAsia="Times New Roman" w:hAnsi="Arial" w:cs="Arial"/>
+          <w:color w:val="000000"/>
+          <w:lang w:eastAsia="pl-PL"/>
+        </w:rPr>
+        <w:t>will</w:t>
+      </w:r>
+      <w:r>
+        <w:rPr>
+          <w:rFonts w:ascii="Arial" w:eastAsia="Times New Roman" w:hAnsi="Arial" w:cs="Arial"/>
+          <w:color w:val="000000"/>
+          <w:lang w:eastAsia="pl-PL"/>
+        </w:rPr>
+        <w:t xml:space="preserve"> be able to write and read reviews of songs, albums, and artists.</w:t>
       </w:r>
     </w:p>
     <w:p>
@@ -2526,21 +2618,10 @@
     </w:p>
     <w:p>
       <w:pPr>
-        <w:spacing w:after="0" w:line="240" w:lineRule="auto"/>
-        <w:rPr>
-          <w:rFonts w:ascii="Times New Roman" w:eastAsia="Times New Roman" w:hAnsi="Times New Roman" w:cs="Times New Roman"/>
-          <w:sz w:val="24"/>
-          <w:szCs w:val="24"/>
-          <w:lang w:eastAsia="pl-PL"/>
-        </w:rPr>
-      </w:pPr>
-    </w:p>
-    <w:p>
-      <w:pPr>
         <w:spacing w:before="360" w:after="120" w:line="240" w:lineRule="auto"/>
         <w:outlineLvl w:val="1"/>
         <w:rPr>
-          <w:rFonts w:ascii="Times New Roman" w:eastAsia="Times New Roman" w:hAnsi="Times New Roman" w:cs="Times New Roman"/>
+          <w:rFonts w:ascii="Arial" w:eastAsia="Times New Roman" w:hAnsi="Arial" w:cs="Arial"/>
           <w:b/>
           <w:bCs/>
           <w:sz w:val="36"/>
@@ -2568,6 +2649,18 @@
         </w:rPr>
         <w:t>Content Display and Customization</w:t>
       </w:r>
+    </w:p>
+    <w:p>
+      <w:pPr>
+        <w:spacing w:after="0" w:line="240" w:lineRule="auto"/>
+        <w:ind w:left="1440"/>
+        <w:textAlignment w:val="baseline"/>
+        <w:rPr>
+          <w:rFonts w:ascii="Arial" w:eastAsia="Times New Roman" w:hAnsi="Arial" w:cs="Arial"/>
+          <w:color w:val="000000"/>
+          <w:lang w:eastAsia="pl-PL"/>
+        </w:rPr>
+      </w:pPr>
     </w:p>
     <w:p>
       <w:pPr>
@@ -2638,7 +2731,23 @@
           <w:color w:val="000000"/>
           <w:lang w:eastAsia="pl-PL"/>
         </w:rPr>
-        <w:t>The system shall categorize music by year, genre, and popularity for easy search and discovery.</w:t>
+        <w:t xml:space="preserve">The system shall </w:t>
+      </w:r>
+      <w:r>
+        <w:rPr>
+          <w:rFonts w:ascii="Arial" w:eastAsia="Times New Roman" w:hAnsi="Arial" w:cs="Arial"/>
+          <w:color w:val="000000"/>
+          <w:lang w:eastAsia="pl-PL"/>
+        </w:rPr>
+        <w:t>categorise</w:t>
+      </w:r>
+      <w:r>
+        <w:rPr>
+          <w:rFonts w:ascii="Arial" w:eastAsia="Times New Roman" w:hAnsi="Arial" w:cs="Arial"/>
+          <w:color w:val="000000"/>
+          <w:lang w:eastAsia="pl-PL"/>
+        </w:rPr>
+        <w:t xml:space="preserve"> music by year, genre, and popularity for easy search and discovery.</w:t>
       </w:r>
     </w:p>
     <w:p>
@@ -2662,7 +2771,39 @@
           <w:color w:val="000000"/>
           <w:lang w:eastAsia="pl-PL"/>
         </w:rPr>
-        <w:t>Users shall be able to customize their music preferences in the settings.</w:t>
+        <w:t xml:space="preserve">Users </w:t>
+      </w:r>
+      <w:r>
+        <w:rPr>
+          <w:rFonts w:ascii="Arial" w:eastAsia="Times New Roman" w:hAnsi="Arial" w:cs="Arial"/>
+          <w:color w:val="000000"/>
+          <w:lang w:eastAsia="pl-PL"/>
+        </w:rPr>
+        <w:t>will</w:t>
+      </w:r>
+      <w:r>
+        <w:rPr>
+          <w:rFonts w:ascii="Arial" w:eastAsia="Times New Roman" w:hAnsi="Arial" w:cs="Arial"/>
+          <w:color w:val="000000"/>
+          <w:lang w:eastAsia="pl-PL"/>
+        </w:rPr>
+        <w:t xml:space="preserve"> be able to </w:t>
+      </w:r>
+      <w:r>
+        <w:rPr>
+          <w:rFonts w:ascii="Arial" w:eastAsia="Times New Roman" w:hAnsi="Arial" w:cs="Arial"/>
+          <w:color w:val="000000"/>
+          <w:lang w:eastAsia="pl-PL"/>
+        </w:rPr>
+        <w:t>customise</w:t>
+      </w:r>
+      <w:r>
+        <w:rPr>
+          <w:rFonts w:ascii="Arial" w:eastAsia="Times New Roman" w:hAnsi="Arial" w:cs="Arial"/>
+          <w:color w:val="000000"/>
+          <w:lang w:eastAsia="pl-PL"/>
+        </w:rPr>
+        <w:t xml:space="preserve"> their music preferences in the settings.</w:t>
       </w:r>
     </w:p>
     <w:p>
@@ -2670,7 +2811,7 @@
         <w:spacing w:before="360" w:after="120" w:line="240" w:lineRule="auto"/>
         <w:outlineLvl w:val="1"/>
         <w:rPr>
-          <w:rFonts w:ascii="Times New Roman" w:eastAsia="Times New Roman" w:hAnsi="Times New Roman" w:cs="Times New Roman"/>
+          <w:rFonts w:ascii="Arial" w:eastAsia="Times New Roman" w:hAnsi="Arial" w:cs="Arial"/>
           <w:b/>
           <w:bCs/>
           <w:sz w:val="36"/>
@@ -2698,6 +2839,18 @@
         </w:rPr>
         <w:t>User Categorization</w:t>
       </w:r>
+    </w:p>
+    <w:p>
+      <w:pPr>
+        <w:spacing w:after="0" w:line="240" w:lineRule="auto"/>
+        <w:ind w:left="1440"/>
+        <w:textAlignment w:val="baseline"/>
+        <w:rPr>
+          <w:rFonts w:ascii="Arial" w:eastAsia="Times New Roman" w:hAnsi="Arial" w:cs="Arial"/>
+          <w:color w:val="000000"/>
+          <w:lang w:eastAsia="pl-PL"/>
+        </w:rPr>
+      </w:pPr>
     </w:p>
     <w:p>
       <w:pPr>
@@ -2744,7 +2897,25 @@
           <w:color w:val="000000"/>
           <w:lang w:eastAsia="pl-PL"/>
         </w:rPr>
-        <w:t>Comments and reviews from Professionals and Artists shall be prioritized and displayed prominently.</w:t>
+        <w:t xml:space="preserve">Comments and reviews from Professionals and Artists shall be </w:t>
+      </w:r>
+      <w:proofErr w:type="spellStart"/>
+      <w:r>
+        <w:rPr>
+          <w:rFonts w:ascii="Arial" w:eastAsia="Times New Roman" w:hAnsi="Arial" w:cs="Arial"/>
+          <w:color w:val="000000"/>
+          <w:lang w:eastAsia="pl-PL"/>
+        </w:rPr>
+        <w:t>prioritised</w:t>
+      </w:r>
+      <w:proofErr w:type="spellEnd"/>
+      <w:r>
+        <w:rPr>
+          <w:rFonts w:ascii="Arial" w:eastAsia="Times New Roman" w:hAnsi="Arial" w:cs="Arial"/>
+          <w:color w:val="000000"/>
+          <w:lang w:eastAsia="pl-PL"/>
+        </w:rPr>
+        <w:t xml:space="preserve"> and displayed prominently.</w:t>
       </w:r>
     </w:p>
     <w:p>
@@ -2752,7 +2923,63 @@
         <w:spacing w:before="400" w:after="120" w:line="240" w:lineRule="auto"/>
         <w:outlineLvl w:val="0"/>
         <w:rPr>
-          <w:rFonts w:ascii="Times New Roman" w:eastAsia="Times New Roman" w:hAnsi="Times New Roman" w:cs="Times New Roman"/>
+          <w:rFonts w:ascii="Arial" w:eastAsia="Times New Roman" w:hAnsi="Arial" w:cs="Arial"/>
+          <w:color w:val="000000"/>
+          <w:kern w:val="36"/>
+          <w:sz w:val="40"/>
+          <w:szCs w:val="40"/>
+          <w:lang w:eastAsia="pl-PL"/>
+        </w:rPr>
+      </w:pPr>
+    </w:p>
+    <w:p>
+      <w:pPr>
+        <w:spacing w:before="400" w:after="120" w:line="240" w:lineRule="auto"/>
+        <w:outlineLvl w:val="0"/>
+        <w:rPr>
+          <w:rFonts w:ascii="Arial" w:eastAsia="Times New Roman" w:hAnsi="Arial" w:cs="Arial"/>
+          <w:color w:val="000000"/>
+          <w:kern w:val="36"/>
+          <w:sz w:val="40"/>
+          <w:szCs w:val="40"/>
+          <w:lang w:eastAsia="pl-PL"/>
+        </w:rPr>
+      </w:pPr>
+    </w:p>
+    <w:p>
+      <w:pPr>
+        <w:spacing w:before="400" w:after="120" w:line="240" w:lineRule="auto"/>
+        <w:outlineLvl w:val="0"/>
+        <w:rPr>
+          <w:rFonts w:ascii="Arial" w:eastAsia="Times New Roman" w:hAnsi="Arial" w:cs="Arial"/>
+          <w:color w:val="000000"/>
+          <w:kern w:val="36"/>
+          <w:sz w:val="40"/>
+          <w:szCs w:val="40"/>
+          <w:lang w:eastAsia="pl-PL"/>
+        </w:rPr>
+      </w:pPr>
+    </w:p>
+    <w:p>
+      <w:pPr>
+        <w:spacing w:before="400" w:after="120" w:line="240" w:lineRule="auto"/>
+        <w:outlineLvl w:val="0"/>
+        <w:rPr>
+          <w:rFonts w:ascii="Arial" w:eastAsia="Times New Roman" w:hAnsi="Arial" w:cs="Arial"/>
+          <w:color w:val="000000"/>
+          <w:kern w:val="36"/>
+          <w:sz w:val="40"/>
+          <w:szCs w:val="40"/>
+          <w:lang w:eastAsia="pl-PL"/>
+        </w:rPr>
+      </w:pPr>
+    </w:p>
+    <w:p>
+      <w:pPr>
+        <w:spacing w:before="400" w:after="120" w:line="240" w:lineRule="auto"/>
+        <w:outlineLvl w:val="0"/>
+        <w:rPr>
+          <w:rFonts w:ascii="Arial" w:eastAsia="Times New Roman" w:hAnsi="Arial" w:cs="Arial"/>
           <w:b/>
           <w:bCs/>
           <w:kern w:val="36"/>
@@ -2770,6 +2997,7 @@
           <w:szCs w:val="40"/>
           <w:lang w:eastAsia="pl-PL"/>
         </w:rPr>
+        <w:lastRenderedPageBreak/>
         <w:t>Non-Functional Requirements</w:t>
       </w:r>
     </w:p>
@@ -2778,22 +3006,21 @@
         <w:spacing w:before="360" w:after="120" w:line="240" w:lineRule="auto"/>
         <w:outlineLvl w:val="1"/>
         <w:rPr>
-          <w:rFonts w:ascii="Times New Roman" w:eastAsia="Times New Roman" w:hAnsi="Times New Roman" w:cs="Times New Roman"/>
-          <w:b/>
-          <w:bCs/>
-          <w:sz w:val="36"/>
-          <w:szCs w:val="36"/>
-          <w:lang w:eastAsia="pl-PL"/>
-        </w:rPr>
-      </w:pPr>
-      <w:r>
-        <w:rPr>
           <w:rFonts w:ascii="Arial" w:eastAsia="Times New Roman" w:hAnsi="Arial" w:cs="Arial"/>
           <w:color w:val="000000"/>
           <w:sz w:val="32"/>
           <w:szCs w:val="32"/>
           <w:lang w:eastAsia="pl-PL"/>
         </w:rPr>
+      </w:pPr>
+      <w:r>
+        <w:rPr>
+          <w:rFonts w:ascii="Arial" w:eastAsia="Times New Roman" w:hAnsi="Arial" w:cs="Arial"/>
+          <w:color w:val="000000"/>
+          <w:sz w:val="32"/>
+          <w:szCs w:val="32"/>
+          <w:lang w:eastAsia="pl-PL"/>
+        </w:rPr>
         <w:t>NFR.1 Usability</w:t>
       </w:r>
     </w:p>
@@ -2801,7 +3028,17 @@
       <w:pPr>
         <w:spacing w:after="0" w:line="240" w:lineRule="auto"/>
         <w:rPr>
-          <w:rFonts w:ascii="Times New Roman" w:eastAsia="Times New Roman" w:hAnsi="Times New Roman" w:cs="Times New Roman"/>
+          <w:rFonts w:ascii="Arial" w:eastAsia="Times New Roman" w:hAnsi="Arial" w:cs="Arial"/>
+          <w:color w:val="000000"/>
+          <w:lang w:eastAsia="pl-PL"/>
+        </w:rPr>
+      </w:pPr>
+    </w:p>
+    <w:p>
+      <w:pPr>
+        <w:spacing w:after="0" w:line="240" w:lineRule="auto"/>
+        <w:rPr>
+          <w:rFonts w:ascii="Arial" w:eastAsia="Times New Roman" w:hAnsi="Arial" w:cs="Arial"/>
           <w:sz w:val="24"/>
           <w:szCs w:val="24"/>
           <w:lang w:eastAsia="pl-PL"/>
@@ -2864,22 +3101,21 @@
       <w:pPr>
         <w:spacing w:after="0" w:line="240" w:lineRule="auto"/>
         <w:rPr>
-          <w:rFonts w:ascii="Times New Roman" w:eastAsia="Times New Roman" w:hAnsi="Times New Roman" w:cs="Times New Roman"/>
-          <w:b/>
-          <w:bCs/>
-          <w:sz w:val="36"/>
-          <w:szCs w:val="36"/>
-          <w:lang w:eastAsia="pl-PL"/>
-        </w:rPr>
-      </w:pPr>
-      <w:r>
-        <w:rPr>
           <w:rFonts w:ascii="Arial" w:eastAsia="Times New Roman" w:hAnsi="Arial" w:cs="Arial"/>
           <w:color w:val="000000"/>
           <w:sz w:val="32"/>
           <w:szCs w:val="32"/>
           <w:lang w:eastAsia="pl-PL"/>
         </w:rPr>
+      </w:pPr>
+      <w:r>
+        <w:rPr>
+          <w:rFonts w:ascii="Arial" w:eastAsia="Times New Roman" w:hAnsi="Arial" w:cs="Arial"/>
+          <w:color w:val="000000"/>
+          <w:sz w:val="32"/>
+          <w:szCs w:val="32"/>
+          <w:lang w:eastAsia="pl-PL"/>
+        </w:rPr>
         <w:t>NFR.2 Scalability</w:t>
       </w:r>
     </w:p>
@@ -2887,7 +3123,17 @@
       <w:pPr>
         <w:spacing w:after="0" w:line="240" w:lineRule="auto"/>
         <w:rPr>
-          <w:rFonts w:ascii="Times New Roman" w:eastAsia="Times New Roman" w:hAnsi="Times New Roman" w:cs="Times New Roman"/>
+          <w:rFonts w:ascii="Arial" w:eastAsia="Times New Roman" w:hAnsi="Arial" w:cs="Arial"/>
+          <w:color w:val="000000"/>
+          <w:lang w:eastAsia="pl-PL"/>
+        </w:rPr>
+      </w:pPr>
+    </w:p>
+    <w:p>
+      <w:pPr>
+        <w:spacing w:after="0" w:line="240" w:lineRule="auto"/>
+        <w:rPr>
+          <w:rFonts w:ascii="Arial" w:eastAsia="Times New Roman" w:hAnsi="Arial" w:cs="Arial"/>
           <w:sz w:val="24"/>
           <w:szCs w:val="24"/>
           <w:lang w:eastAsia="pl-PL"/>
@@ -2906,63 +3152,41 @@
       <w:pPr>
         <w:spacing w:after="0" w:line="240" w:lineRule="auto"/>
         <w:rPr>
-          <w:rFonts w:ascii="Times New Roman" w:eastAsia="Times New Roman" w:hAnsi="Times New Roman" w:cs="Times New Roman"/>
+          <w:rFonts w:ascii="Arial" w:eastAsia="Times New Roman" w:hAnsi="Arial" w:cs="Arial"/>
+          <w:color w:val="000000"/>
+          <w:lang w:eastAsia="pl-PL"/>
+        </w:rPr>
+      </w:pPr>
+      <w:r>
+        <w:rPr>
+          <w:rFonts w:ascii="Arial" w:eastAsia="Times New Roman" w:hAnsi="Arial" w:cs="Arial"/>
+          <w:color w:val="000000"/>
+          <w:lang w:eastAsia="pl-PL"/>
+        </w:rPr>
+        <w:t>NFR.2.2 Modular and extensible components will be utilised to support incremental updates and enhancements to functionality.</w:t>
+      </w:r>
+    </w:p>
+    <w:p>
+      <w:pPr>
+        <w:spacing w:after="0" w:line="240" w:lineRule="auto"/>
+        <w:rPr>
+          <w:rFonts w:ascii="Arial" w:eastAsia="Times New Roman" w:hAnsi="Arial" w:cs="Arial"/>
           <w:sz w:val="24"/>
           <w:szCs w:val="24"/>
           <w:lang w:eastAsia="pl-PL"/>
         </w:rPr>
       </w:pPr>
-      <w:r>
-        <w:rPr>
-          <w:rFonts w:ascii="Arial" w:eastAsia="Times New Roman" w:hAnsi="Arial" w:cs="Arial"/>
-          <w:color w:val="000000"/>
-          <w:lang w:eastAsia="pl-PL"/>
-        </w:rPr>
-        <w:t xml:space="preserve">NFR.2.2 Modular and extensible components will be </w:t>
-      </w:r>
-      <w:proofErr w:type="spellStart"/>
-      <w:r>
-        <w:rPr>
-          <w:rFonts w:ascii="Arial" w:eastAsia="Times New Roman" w:hAnsi="Arial" w:cs="Arial"/>
-          <w:color w:val="000000"/>
-          <w:lang w:eastAsia="pl-PL"/>
-        </w:rPr>
-        <w:t>utilised</w:t>
-      </w:r>
-      <w:proofErr w:type="spellEnd"/>
-      <w:r>
-        <w:rPr>
-          <w:rFonts w:ascii="Arial" w:eastAsia="Times New Roman" w:hAnsi="Arial" w:cs="Arial"/>
-          <w:color w:val="000000"/>
-          <w:lang w:eastAsia="pl-PL"/>
-        </w:rPr>
-        <w:t xml:space="preserve"> to support incremental updates and enhancements to functionality.</w:t>
-      </w:r>
     </w:p>
     <w:p>
       <w:pPr>
         <w:spacing w:after="0" w:line="240" w:lineRule="auto"/>
         <w:rPr>
-          <w:rFonts w:ascii="Times New Roman" w:eastAsia="Times New Roman" w:hAnsi="Times New Roman" w:cs="Times New Roman"/>
+          <w:rFonts w:ascii="Arial" w:eastAsia="Times New Roman" w:hAnsi="Arial" w:cs="Arial"/>
           <w:sz w:val="24"/>
           <w:szCs w:val="24"/>
           <w:lang w:eastAsia="pl-PL"/>
         </w:rPr>
       </w:pPr>
-    </w:p>
-    <w:p>
-      <w:pPr>
-        <w:spacing w:before="360" w:after="120" w:line="240" w:lineRule="auto"/>
-        <w:outlineLvl w:val="1"/>
-        <w:rPr>
-          <w:rFonts w:ascii="Times New Roman" w:eastAsia="Times New Roman" w:hAnsi="Times New Roman" w:cs="Times New Roman"/>
-          <w:b/>
-          <w:bCs/>
-          <w:sz w:val="36"/>
-          <w:szCs w:val="36"/>
-          <w:lang w:eastAsia="pl-PL"/>
-        </w:rPr>
-      </w:pPr>
       <w:r>
         <w:rPr>
           <w:rFonts w:ascii="Arial" w:eastAsia="Times New Roman" w:hAnsi="Arial" w:cs="Arial"/>
@@ -2978,7 +3202,17 @@
       <w:pPr>
         <w:spacing w:after="0" w:line="240" w:lineRule="auto"/>
         <w:rPr>
-          <w:rFonts w:ascii="Times New Roman" w:eastAsia="Times New Roman" w:hAnsi="Times New Roman" w:cs="Times New Roman"/>
+          <w:rFonts w:ascii="Arial" w:eastAsia="Times New Roman" w:hAnsi="Arial" w:cs="Arial"/>
+          <w:color w:val="000000"/>
+          <w:lang w:eastAsia="pl-PL"/>
+        </w:rPr>
+      </w:pPr>
+    </w:p>
+    <w:p>
+      <w:pPr>
+        <w:spacing w:after="0" w:line="240" w:lineRule="auto"/>
+        <w:rPr>
+          <w:rFonts w:ascii="Arial" w:eastAsia="Times New Roman" w:hAnsi="Arial" w:cs="Arial"/>
           <w:sz w:val="24"/>
           <w:szCs w:val="24"/>
           <w:lang w:eastAsia="pl-PL"/>
@@ -2997,7 +3231,7 @@
       <w:pPr>
         <w:spacing w:after="0" w:line="240" w:lineRule="auto"/>
         <w:rPr>
-          <w:rFonts w:ascii="Times New Roman" w:eastAsia="Times New Roman" w:hAnsi="Times New Roman" w:cs="Times New Roman"/>
+          <w:rFonts w:ascii="Arial" w:eastAsia="Times New Roman" w:hAnsi="Arial" w:cs="Arial"/>
           <w:sz w:val="24"/>
           <w:szCs w:val="24"/>
           <w:lang w:eastAsia="pl-PL"/>
@@ -3016,7 +3250,7 @@
       <w:pPr>
         <w:spacing w:after="0" w:line="240" w:lineRule="auto"/>
         <w:rPr>
-          <w:rFonts w:ascii="Times New Roman" w:eastAsia="Times New Roman" w:hAnsi="Times New Roman" w:cs="Times New Roman"/>
+          <w:rFonts w:ascii="Arial" w:eastAsia="Times New Roman" w:hAnsi="Arial" w:cs="Arial"/>
           <w:sz w:val="24"/>
           <w:szCs w:val="24"/>
           <w:lang w:eastAsia="pl-PL"/>
@@ -3028,48 +3262,45 @@
           <w:color w:val="000000"/>
           <w:lang w:eastAsia="pl-PL"/>
         </w:rPr>
-        <w:t xml:space="preserve">NFR.3.3 Backup and recovery mechanisms shall be implemented to safeguard against </w:t>
-      </w:r>
-      <w:proofErr w:type="gramStart"/>
-      <w:r>
-        <w:rPr>
-          <w:rFonts w:ascii="Arial" w:eastAsia="Times New Roman" w:hAnsi="Arial" w:cs="Arial"/>
-          <w:color w:val="000000"/>
-          <w:lang w:eastAsia="pl-PL"/>
-        </w:rPr>
-        <w:t>data</w:t>
-      </w:r>
-      <w:proofErr w:type="gramEnd"/>
+        <w:t>NFR.3.3 Backup and recovery mechanisms shall be implemented to safeguard against data</w:t>
+      </w:r>
     </w:p>
     <w:p>
       <w:pPr>
         <w:spacing w:after="0" w:line="240" w:lineRule="auto"/>
         <w:rPr>
-          <w:rFonts w:ascii="Times New Roman" w:eastAsia="Times New Roman" w:hAnsi="Times New Roman" w:cs="Times New Roman"/>
+          <w:rFonts w:ascii="Arial" w:eastAsia="Times New Roman" w:hAnsi="Arial" w:cs="Arial"/>
+          <w:color w:val="000000"/>
+          <w:lang w:eastAsia="pl-PL"/>
+        </w:rPr>
+      </w:pPr>
+      <w:r>
+        <w:rPr>
+          <w:rFonts w:ascii="Arial" w:eastAsia="Times New Roman" w:hAnsi="Arial" w:cs="Arial"/>
+          <w:color w:val="000000"/>
+          <w:lang w:eastAsia="pl-PL"/>
+        </w:rPr>
+        <w:t>loss or system failures</w:t>
+      </w:r>
+    </w:p>
+    <w:p>
+      <w:pPr>
+        <w:spacing w:after="0" w:line="240" w:lineRule="auto"/>
+        <w:rPr>
+          <w:rFonts w:ascii="Arial" w:eastAsia="Times New Roman" w:hAnsi="Arial" w:cs="Arial"/>
           <w:sz w:val="24"/>
           <w:szCs w:val="24"/>
           <w:lang w:eastAsia="pl-PL"/>
         </w:rPr>
       </w:pPr>
-      <w:r>
-        <w:rPr>
-          <w:rFonts w:ascii="Arial" w:eastAsia="Times New Roman" w:hAnsi="Arial" w:cs="Arial"/>
-          <w:color w:val="000000"/>
-          <w:lang w:eastAsia="pl-PL"/>
-        </w:rPr>
-        <w:t>loss or system failures</w:t>
-      </w:r>
-    </w:p>
-    <w:p>
-      <w:pPr>
-        <w:spacing w:before="360" w:after="120" w:line="240" w:lineRule="auto"/>
-        <w:outlineLvl w:val="1"/>
-        <w:rPr>
-          <w:rFonts w:ascii="Times New Roman" w:eastAsia="Times New Roman" w:hAnsi="Times New Roman" w:cs="Times New Roman"/>
-          <w:b/>
-          <w:bCs/>
-          <w:sz w:val="36"/>
-          <w:szCs w:val="36"/>
+    </w:p>
+    <w:p>
+      <w:pPr>
+        <w:spacing w:after="0" w:line="240" w:lineRule="auto"/>
+        <w:rPr>
+          <w:rFonts w:ascii="Arial" w:eastAsia="Times New Roman" w:hAnsi="Arial" w:cs="Arial"/>
+          <w:sz w:val="24"/>
+          <w:szCs w:val="24"/>
           <w:lang w:eastAsia="pl-PL"/>
         </w:rPr>
       </w:pPr>
@@ -3088,7 +3319,17 @@
       <w:pPr>
         <w:spacing w:after="0" w:line="240" w:lineRule="auto"/>
         <w:rPr>
-          <w:rFonts w:ascii="Times New Roman" w:eastAsia="Times New Roman" w:hAnsi="Times New Roman" w:cs="Times New Roman"/>
+          <w:rFonts w:ascii="Arial" w:eastAsia="Times New Roman" w:hAnsi="Arial" w:cs="Arial"/>
+          <w:color w:val="000000"/>
+          <w:lang w:eastAsia="pl-PL"/>
+        </w:rPr>
+      </w:pPr>
+    </w:p>
+    <w:p>
+      <w:pPr>
+        <w:spacing w:after="0" w:line="240" w:lineRule="auto"/>
+        <w:rPr>
+          <w:rFonts w:ascii="Arial" w:eastAsia="Times New Roman" w:hAnsi="Arial" w:cs="Arial"/>
           <w:sz w:val="24"/>
           <w:szCs w:val="24"/>
           <w:lang w:eastAsia="pl-PL"/>
@@ -3107,7 +3348,7 @@
       <w:pPr>
         <w:spacing w:after="0" w:line="240" w:lineRule="auto"/>
         <w:rPr>
-          <w:rFonts w:ascii="Times New Roman" w:eastAsia="Times New Roman" w:hAnsi="Times New Roman" w:cs="Times New Roman"/>
+          <w:rFonts w:ascii="Arial" w:eastAsia="Times New Roman" w:hAnsi="Arial" w:cs="Arial"/>
           <w:sz w:val="24"/>
           <w:szCs w:val="24"/>
           <w:lang w:eastAsia="pl-PL"/>
@@ -3119,7 +3360,6 @@
           <w:color w:val="000000"/>
           <w:lang w:eastAsia="pl-PL"/>
         </w:rPr>
-        <w:lastRenderedPageBreak/>
         <w:t>NFR.4.2 The system will implement user authentication mechanisms (e.g., username/password, multi-factor authentication). This will help to verify the identity of users and add another layer of security to the system.</w:t>
       </w:r>
     </w:p>
@@ -3127,31 +3367,38 @@
       <w:pPr>
         <w:spacing w:after="0" w:line="240" w:lineRule="auto"/>
         <w:rPr>
-          <w:rFonts w:ascii="Times New Roman" w:eastAsia="Times New Roman" w:hAnsi="Times New Roman" w:cs="Times New Roman"/>
+          <w:rFonts w:ascii="Arial" w:eastAsia="Times New Roman" w:hAnsi="Arial" w:cs="Arial"/>
+          <w:color w:val="000000"/>
+          <w:lang w:eastAsia="pl-PL"/>
+        </w:rPr>
+      </w:pPr>
+      <w:r>
+        <w:rPr>
+          <w:rFonts w:ascii="Arial" w:eastAsia="Times New Roman" w:hAnsi="Arial" w:cs="Arial"/>
+          <w:color w:val="000000"/>
+          <w:lang w:eastAsia="pl-PL"/>
+        </w:rPr>
+        <w:t>NFR.4.3 The system will implement data encryption protocols to protect confidential data during transmission (e.g., https). This will ensure that confidential data is protected.</w:t>
+      </w:r>
+    </w:p>
+    <w:p>
+      <w:pPr>
+        <w:spacing w:after="0" w:line="240" w:lineRule="auto"/>
+        <w:rPr>
+          <w:rFonts w:ascii="Arial" w:eastAsia="Times New Roman" w:hAnsi="Arial" w:cs="Arial"/>
           <w:sz w:val="24"/>
           <w:szCs w:val="24"/>
           <w:lang w:eastAsia="pl-PL"/>
         </w:rPr>
       </w:pPr>
-      <w:r>
-        <w:rPr>
-          <w:rFonts w:ascii="Arial" w:eastAsia="Times New Roman" w:hAnsi="Arial" w:cs="Arial"/>
-          <w:color w:val="000000"/>
-          <w:lang w:eastAsia="pl-PL"/>
-        </w:rPr>
-        <w:t>NFR.4.3 The system will implement data encryption protocols to protect confidential data during transmission (e.g., https). This will ensure that confidential data is protected.</w:t>
-      </w:r>
-    </w:p>
-    <w:p>
-      <w:pPr>
-        <w:spacing w:before="360" w:after="120" w:line="240" w:lineRule="auto"/>
-        <w:outlineLvl w:val="1"/>
-        <w:rPr>
-          <w:rFonts w:ascii="Times New Roman" w:eastAsia="Times New Roman" w:hAnsi="Times New Roman" w:cs="Times New Roman"/>
-          <w:b/>
-          <w:bCs/>
-          <w:sz w:val="36"/>
-          <w:szCs w:val="36"/>
+    </w:p>
+    <w:p>
+      <w:pPr>
+        <w:spacing w:after="0" w:line="240" w:lineRule="auto"/>
+        <w:rPr>
+          <w:rFonts w:ascii="Arial" w:eastAsia="Times New Roman" w:hAnsi="Arial" w:cs="Arial"/>
+          <w:sz w:val="24"/>
+          <w:szCs w:val="24"/>
           <w:lang w:eastAsia="pl-PL"/>
         </w:rPr>
       </w:pPr>
@@ -3175,6 +3422,16 @@
           <w:lang w:eastAsia="pl-PL"/>
         </w:rPr>
       </w:pPr>
+    </w:p>
+    <w:p>
+      <w:pPr>
+        <w:spacing w:after="0" w:line="240" w:lineRule="auto"/>
+        <w:rPr>
+          <w:rFonts w:ascii="Arial" w:eastAsia="Times New Roman" w:hAnsi="Arial" w:cs="Arial"/>
+          <w:color w:val="000000"/>
+          <w:lang w:eastAsia="pl-PL"/>
+        </w:rPr>
+      </w:pPr>
       <w:r>
         <w:rPr>
           <w:rFonts w:ascii="Arial" w:eastAsia="Times New Roman" w:hAnsi="Arial" w:cs="Arial"/>
@@ -3196,7 +3453,7 @@
       <w:pPr>
         <w:spacing w:after="0" w:line="240" w:lineRule="auto"/>
         <w:rPr>
-          <w:rFonts w:ascii="Times New Roman" w:eastAsia="Times New Roman" w:hAnsi="Times New Roman" w:cs="Times New Roman"/>
+          <w:rFonts w:ascii="Arial" w:eastAsia="Times New Roman" w:hAnsi="Arial" w:cs="Arial"/>
           <w:sz w:val="24"/>
           <w:szCs w:val="24"/>
           <w:lang w:eastAsia="pl-PL"/>
@@ -3215,28 +3472,64 @@
       <w:pPr>
         <w:spacing w:after="240" w:line="240" w:lineRule="auto"/>
         <w:rPr>
-          <w:rFonts w:ascii="Times New Roman" w:eastAsia="Times New Roman" w:hAnsi="Times New Roman" w:cs="Times New Roman"/>
+          <w:rFonts w:ascii="Arial" w:eastAsia="Times New Roman" w:hAnsi="Arial" w:cs="Arial"/>
           <w:sz w:val="24"/>
           <w:szCs w:val="24"/>
           <w:lang w:eastAsia="pl-PL"/>
         </w:rPr>
       </w:pPr>
-      <w:r>
-        <w:rPr>
-          <w:rFonts w:ascii="Times New Roman" w:eastAsia="Times New Roman" w:hAnsi="Times New Roman" w:cs="Times New Roman"/>
+    </w:p>
+    <w:p>
+      <w:pPr>
+        <w:spacing w:after="240" w:line="240" w:lineRule="auto"/>
+        <w:rPr>
+          <w:rFonts w:ascii="Arial" w:eastAsia="Times New Roman" w:hAnsi="Arial" w:cs="Arial"/>
           <w:sz w:val="24"/>
           <w:szCs w:val="24"/>
           <w:lang w:eastAsia="pl-PL"/>
         </w:rPr>
-        <w:br/>
-      </w:r>
+      </w:pPr>
+    </w:p>
+    <w:p>
+      <w:pPr>
+        <w:spacing w:after="240" w:line="240" w:lineRule="auto"/>
+        <w:rPr>
+          <w:rFonts w:ascii="Arial" w:eastAsia="Times New Roman" w:hAnsi="Arial" w:cs="Arial"/>
+          <w:sz w:val="24"/>
+          <w:szCs w:val="24"/>
+          <w:lang w:eastAsia="pl-PL"/>
+        </w:rPr>
+      </w:pPr>
+    </w:p>
+    <w:p>
+      <w:pPr>
+        <w:spacing w:after="240" w:line="240" w:lineRule="auto"/>
+        <w:rPr>
+          <w:rFonts w:ascii="Arial" w:eastAsia="Times New Roman" w:hAnsi="Arial" w:cs="Arial"/>
+          <w:sz w:val="24"/>
+          <w:szCs w:val="24"/>
+          <w:lang w:eastAsia="pl-PL"/>
+        </w:rPr>
+      </w:pPr>
     </w:p>
     <w:p>
       <w:pPr>
         <w:spacing w:before="400" w:after="120" w:line="240" w:lineRule="auto"/>
         <w:outlineLvl w:val="0"/>
         <w:rPr>
-          <w:rFonts w:ascii="Times New Roman" w:eastAsia="Times New Roman" w:hAnsi="Times New Roman" w:cs="Times New Roman"/>
+          <w:rFonts w:ascii="Arial" w:eastAsia="Times New Roman" w:hAnsi="Arial" w:cs="Arial"/>
+          <w:sz w:val="24"/>
+          <w:szCs w:val="24"/>
+          <w:lang w:eastAsia="pl-PL"/>
+        </w:rPr>
+      </w:pPr>
+    </w:p>
+    <w:p>
+      <w:pPr>
+        <w:spacing w:before="400" w:after="120" w:line="240" w:lineRule="auto"/>
+        <w:outlineLvl w:val="0"/>
+        <w:rPr>
+          <w:rFonts w:ascii="Arial" w:eastAsia="Times New Roman" w:hAnsi="Arial" w:cs="Arial"/>
           <w:b/>
           <w:bCs/>
           <w:kern w:val="36"/>
@@ -3254,6 +3547,7 @@
           <w:szCs w:val="40"/>
           <w:lang w:eastAsia="pl-PL"/>
         </w:rPr>
+        <w:lastRenderedPageBreak/>
         <w:t>Use Cases</w:t>
       </w:r>
     </w:p>
@@ -3262,7 +3556,7 @@
         <w:spacing w:before="360" w:after="120" w:line="240" w:lineRule="auto"/>
         <w:outlineLvl w:val="1"/>
         <w:rPr>
-          <w:rFonts w:ascii="Times New Roman" w:eastAsia="Times New Roman" w:hAnsi="Times New Roman" w:cs="Times New Roman"/>
+          <w:rFonts w:ascii="Arial" w:eastAsia="Times New Roman" w:hAnsi="Arial" w:cs="Arial"/>
           <w:b/>
           <w:bCs/>
           <w:sz w:val="36"/>
@@ -3295,7 +3589,7 @@
       <w:pPr>
         <w:spacing w:after="0" w:line="240" w:lineRule="auto"/>
         <w:rPr>
-          <w:rFonts w:ascii="Times New Roman" w:eastAsia="Times New Roman" w:hAnsi="Times New Roman" w:cs="Times New Roman"/>
+          <w:rFonts w:ascii="Arial" w:eastAsia="Times New Roman" w:hAnsi="Arial" w:cs="Arial"/>
           <w:sz w:val="24"/>
           <w:szCs w:val="24"/>
           <w:lang w:eastAsia="pl-PL"/>
@@ -3322,7 +3616,7 @@
       <w:pPr>
         <w:spacing w:after="0" w:line="240" w:lineRule="auto"/>
         <w:rPr>
-          <w:rFonts w:ascii="Times New Roman" w:eastAsia="Times New Roman" w:hAnsi="Times New Roman" w:cs="Times New Roman"/>
+          <w:rFonts w:ascii="Arial" w:eastAsia="Times New Roman" w:hAnsi="Arial" w:cs="Arial"/>
           <w:sz w:val="24"/>
           <w:szCs w:val="24"/>
           <w:lang w:eastAsia="pl-PL"/>
@@ -3381,7 +3675,7 @@
       <w:pPr>
         <w:spacing w:after="0" w:line="240" w:lineRule="auto"/>
         <w:rPr>
-          <w:rFonts w:ascii="Times New Roman" w:eastAsia="Times New Roman" w:hAnsi="Times New Roman" w:cs="Times New Roman"/>
+          <w:rFonts w:ascii="Arial" w:eastAsia="Times New Roman" w:hAnsi="Arial" w:cs="Arial"/>
           <w:sz w:val="24"/>
           <w:szCs w:val="24"/>
           <w:lang w:eastAsia="pl-PL"/>
@@ -3416,7 +3710,7 @@
       <w:pPr>
         <w:spacing w:after="0" w:line="240" w:lineRule="auto"/>
         <w:rPr>
-          <w:rFonts w:ascii="Times New Roman" w:eastAsia="Times New Roman" w:hAnsi="Times New Roman" w:cs="Times New Roman"/>
+          <w:rFonts w:ascii="Arial" w:eastAsia="Times New Roman" w:hAnsi="Arial" w:cs="Arial"/>
           <w:sz w:val="24"/>
           <w:szCs w:val="24"/>
           <w:lang w:eastAsia="pl-PL"/>
@@ -3427,7 +3721,7 @@
       <w:pPr>
         <w:spacing w:after="0" w:line="240" w:lineRule="auto"/>
         <w:rPr>
-          <w:rFonts w:ascii="Times New Roman" w:eastAsia="Times New Roman" w:hAnsi="Times New Roman" w:cs="Times New Roman"/>
+          <w:rFonts w:ascii="Arial" w:eastAsia="Times New Roman" w:hAnsi="Arial" w:cs="Arial"/>
           <w:sz w:val="24"/>
           <w:szCs w:val="24"/>
           <w:lang w:eastAsia="pl-PL"/>
@@ -3441,20 +3735,9 @@
         </w:rPr>
         <w:t>Main Success Scenario: </w:t>
       </w:r>
-    </w:p>
-    <w:p>
-      <w:pPr>
-        <w:spacing w:after="0" w:line="240" w:lineRule="auto"/>
-        <w:rPr>
-          <w:rFonts w:ascii="Times New Roman" w:eastAsia="Times New Roman" w:hAnsi="Times New Roman" w:cs="Times New Roman"/>
-          <w:sz w:val="24"/>
-          <w:szCs w:val="24"/>
-          <w:lang w:eastAsia="pl-PL"/>
-        </w:rPr>
-      </w:pPr>
-      <w:r>
-        <w:rPr>
-          <w:rFonts w:ascii="Times New Roman" w:eastAsia="Times New Roman" w:hAnsi="Times New Roman" w:cs="Times New Roman"/>
+      <w:r>
+        <w:rPr>
+          <w:rFonts w:ascii="Arial" w:eastAsia="Times New Roman" w:hAnsi="Arial" w:cs="Arial"/>
           <w:sz w:val="24"/>
           <w:szCs w:val="24"/>
           <w:lang w:eastAsia="pl-PL"/>
@@ -3611,7 +3894,7 @@
         <w:spacing w:after="0" w:line="240" w:lineRule="auto"/>
         <w:textAlignment w:val="baseline"/>
         <w:rPr>
-          <w:rFonts w:ascii="Times New Roman" w:eastAsia="Times New Roman" w:hAnsi="Times New Roman" w:cs="Times New Roman"/>
+          <w:rFonts w:ascii="Arial" w:eastAsia="Times New Roman" w:hAnsi="Arial" w:cs="Arial"/>
           <w:sz w:val="24"/>
           <w:szCs w:val="24"/>
           <w:lang w:eastAsia="pl-PL"/>
@@ -3643,7 +3926,7 @@
         <w:spacing w:after="0" w:line="240" w:lineRule="auto"/>
         <w:textAlignment w:val="baseline"/>
         <w:rPr>
-          <w:rFonts w:ascii="Times New Roman" w:eastAsia="Times New Roman" w:hAnsi="Times New Roman" w:cs="Times New Roman"/>
+          <w:rFonts w:ascii="Arial" w:eastAsia="Times New Roman" w:hAnsi="Arial" w:cs="Arial"/>
           <w:sz w:val="24"/>
           <w:szCs w:val="24"/>
           <w:lang w:eastAsia="pl-PL"/>
@@ -3671,7 +3954,7 @@
         <w:spacing w:after="0" w:line="240" w:lineRule="auto"/>
         <w:textAlignment w:val="baseline"/>
         <w:rPr>
-          <w:rFonts w:ascii="Times New Roman" w:eastAsia="Times New Roman" w:hAnsi="Times New Roman" w:cs="Times New Roman"/>
+          <w:rFonts w:ascii="Arial" w:eastAsia="Times New Roman" w:hAnsi="Arial" w:cs="Arial"/>
           <w:sz w:val="24"/>
           <w:szCs w:val="24"/>
           <w:lang w:eastAsia="pl-PL"/>
@@ -3682,21 +3965,42 @@
       <w:pPr>
         <w:spacing w:after="0" w:line="240" w:lineRule="auto"/>
         <w:rPr>
-          <w:rFonts w:ascii="Times New Roman" w:eastAsia="Times New Roman" w:hAnsi="Times New Roman" w:cs="Times New Roman"/>
-          <w:sz w:val="24"/>
-          <w:szCs w:val="24"/>
-          <w:lang w:eastAsia="pl-PL"/>
-        </w:rPr>
-      </w:pPr>
-      <w:r>
-        <w:rPr>
           <w:rFonts w:ascii="Arial" w:eastAsia="Times New Roman" w:hAnsi="Arial" w:cs="Arial"/>
           <w:b/>
           <w:bCs/>
           <w:color w:val="000000"/>
           <w:lang w:eastAsia="pl-PL"/>
         </w:rPr>
+      </w:pPr>
+      <w:r>
+        <w:rPr>
+          <w:rFonts w:ascii="Arial" w:eastAsia="Times New Roman" w:hAnsi="Arial" w:cs="Arial"/>
+          <w:b/>
+          <w:bCs/>
+          <w:color w:val="000000"/>
+          <w:lang w:eastAsia="pl-PL"/>
+        </w:rPr>
         <w:t>Extensions:</w:t>
+      </w:r>
+    </w:p>
+    <w:p>
+      <w:pPr>
+        <w:spacing w:after="0" w:line="240" w:lineRule="auto"/>
+        <w:ind w:left="720"/>
+        <w:textAlignment w:val="baseline"/>
+        <w:rPr>
+          <w:rFonts w:ascii="Arial" w:eastAsia="Times New Roman" w:hAnsi="Arial" w:cs="Arial"/>
+          <w:color w:val="0D0D0D"/>
+          <w:lang w:eastAsia="pl-PL"/>
+        </w:rPr>
+      </w:pPr>
+      <w:r>
+        <w:rPr>
+          <w:rFonts w:ascii="Arial" w:eastAsia="Times New Roman" w:hAnsi="Arial" w:cs="Arial"/>
+          <w:color w:val="0D0D0D"/>
+          <w:lang w:eastAsia="pl-PL"/>
+        </w:rPr>
+        <w:t> </w:t>
       </w:r>
     </w:p>
     <w:p>
@@ -3719,14 +4023,6 @@
           <w:color w:val="0D0D0D"/>
           <w:lang w:eastAsia="pl-PL"/>
         </w:rPr>
-        <w:t> </w:t>
-      </w:r>
-      <w:r>
-        <w:rPr>
-          <w:rFonts w:ascii="Arial" w:eastAsia="Times New Roman" w:hAnsi="Arial" w:cs="Arial"/>
-          <w:color w:val="0D0D0D"/>
-          <w:lang w:eastAsia="pl-PL"/>
-        </w:rPr>
         <w:t>I</w:t>
       </w:r>
       <w:r>
@@ -3758,14 +4054,6 @@
           <w:color w:val="0D0D0D"/>
           <w:lang w:eastAsia="pl-PL"/>
         </w:rPr>
-        <w:t> </w:t>
-      </w:r>
-      <w:r>
-        <w:rPr>
-          <w:rFonts w:ascii="Arial" w:eastAsia="Times New Roman" w:hAnsi="Arial" w:cs="Arial"/>
-          <w:color w:val="0D0D0D"/>
-          <w:lang w:eastAsia="pl-PL"/>
-        </w:rPr>
         <w:t>I</w:t>
       </w:r>
       <w:r>
@@ -3782,7 +4070,7 @@
         <w:spacing w:before="360" w:after="120" w:line="240" w:lineRule="auto"/>
         <w:outlineLvl w:val="1"/>
         <w:rPr>
-          <w:rFonts w:ascii="Times New Roman" w:eastAsia="Times New Roman" w:hAnsi="Times New Roman" w:cs="Times New Roman"/>
+          <w:rFonts w:ascii="Arial" w:eastAsia="Times New Roman" w:hAnsi="Arial" w:cs="Arial"/>
           <w:b/>
           <w:bCs/>
           <w:sz w:val="36"/>
@@ -3815,7 +4103,7 @@
       <w:pPr>
         <w:spacing w:after="0" w:line="240" w:lineRule="auto"/>
         <w:rPr>
-          <w:rFonts w:ascii="Times New Roman" w:eastAsia="Times New Roman" w:hAnsi="Times New Roman" w:cs="Times New Roman"/>
+          <w:rFonts w:ascii="Arial" w:eastAsia="Times New Roman" w:hAnsi="Arial" w:cs="Arial"/>
           <w:sz w:val="24"/>
           <w:szCs w:val="24"/>
           <w:lang w:eastAsia="pl-PL"/>
@@ -3842,7 +4130,7 @@
       <w:pPr>
         <w:spacing w:after="0" w:line="240" w:lineRule="auto"/>
         <w:rPr>
-          <w:rFonts w:ascii="Times New Roman" w:eastAsia="Times New Roman" w:hAnsi="Times New Roman" w:cs="Times New Roman"/>
+          <w:rFonts w:ascii="Arial" w:eastAsia="Times New Roman" w:hAnsi="Arial" w:cs="Arial"/>
           <w:sz w:val="24"/>
           <w:szCs w:val="24"/>
           <w:lang w:eastAsia="pl-PL"/>
@@ -3877,7 +4165,7 @@
       <w:pPr>
         <w:spacing w:after="0" w:line="240" w:lineRule="auto"/>
         <w:rPr>
-          <w:rFonts w:ascii="Times New Roman" w:eastAsia="Times New Roman" w:hAnsi="Times New Roman" w:cs="Times New Roman"/>
+          <w:rFonts w:ascii="Arial" w:eastAsia="Times New Roman" w:hAnsi="Arial" w:cs="Arial"/>
           <w:sz w:val="24"/>
           <w:szCs w:val="24"/>
           <w:lang w:eastAsia="pl-PL"/>
@@ -3899,22 +4187,20 @@
         </w:rPr>
         <w:t xml:space="preserve">a registered </w:t>
       </w:r>
-      <w:proofErr w:type="gramStart"/>
       <w:r>
         <w:rPr>
           <w:rFonts w:ascii="Arial" w:eastAsia="Times New Roman" w:hAnsi="Arial" w:cs="Arial"/>
           <w:color w:val="0D0D0D"/>
           <w:lang w:eastAsia="pl-PL"/>
         </w:rPr>
-        <w:t>user</w:t>
-      </w:r>
-      <w:proofErr w:type="gramEnd"/>
+        <w:t>user.</w:t>
+      </w:r>
     </w:p>
     <w:p>
       <w:pPr>
         <w:spacing w:after="0" w:line="240" w:lineRule="auto"/>
         <w:rPr>
-          <w:rFonts w:ascii="Times New Roman" w:eastAsia="Times New Roman" w:hAnsi="Times New Roman" w:cs="Times New Roman"/>
+          <w:rFonts w:ascii="Arial" w:eastAsia="Times New Roman" w:hAnsi="Arial" w:cs="Arial"/>
           <w:sz w:val="24"/>
           <w:szCs w:val="24"/>
           <w:lang w:eastAsia="pl-PL"/>
@@ -3925,7 +4211,7 @@
       <w:pPr>
         <w:spacing w:after="0" w:line="240" w:lineRule="auto"/>
         <w:rPr>
-          <w:rFonts w:ascii="Times New Roman" w:eastAsia="Times New Roman" w:hAnsi="Times New Roman" w:cs="Times New Roman"/>
+          <w:rFonts w:ascii="Arial" w:eastAsia="Times New Roman" w:hAnsi="Arial" w:cs="Arial"/>
           <w:sz w:val="24"/>
           <w:szCs w:val="24"/>
           <w:lang w:eastAsia="pl-PL"/>
@@ -3939,20 +4225,9 @@
         </w:rPr>
         <w:t>Main Success Scenario: </w:t>
       </w:r>
-    </w:p>
-    <w:p>
-      <w:pPr>
-        <w:spacing w:after="0" w:line="240" w:lineRule="auto"/>
-        <w:rPr>
-          <w:rFonts w:ascii="Times New Roman" w:eastAsia="Times New Roman" w:hAnsi="Times New Roman" w:cs="Times New Roman"/>
-          <w:sz w:val="24"/>
-          <w:szCs w:val="24"/>
-          <w:lang w:eastAsia="pl-PL"/>
-        </w:rPr>
-      </w:pPr>
-      <w:r>
-        <w:rPr>
-          <w:rFonts w:ascii="Times New Roman" w:eastAsia="Times New Roman" w:hAnsi="Times New Roman" w:cs="Times New Roman"/>
+      <w:r>
+        <w:rPr>
+          <w:rFonts w:ascii="Arial" w:eastAsia="Times New Roman" w:hAnsi="Arial" w:cs="Arial"/>
           <w:sz w:val="24"/>
           <w:szCs w:val="24"/>
           <w:lang w:eastAsia="pl-PL"/>
@@ -3988,7 +4263,31 @@
           <w:color w:val="000000"/>
           <w:lang w:eastAsia="pl-PL"/>
         </w:rPr>
-        <w:t>he User navigates to a review and selects "Like" or "Comment".</w:t>
+        <w:t>he User navigates to a review and selects "Like"</w:t>
+      </w:r>
+      <w:r>
+        <w:rPr>
+          <w:rFonts w:ascii="Arial" w:eastAsia="Times New Roman" w:hAnsi="Arial" w:cs="Arial"/>
+          <w:color w:val="000000"/>
+          <w:lang w:eastAsia="pl-PL"/>
+        </w:rPr>
+        <w:t xml:space="preserve"> or</w:t>
+      </w:r>
+      <w:r>
+        <w:rPr>
+          <w:rFonts w:ascii="Arial" w:eastAsia="Times New Roman" w:hAnsi="Arial" w:cs="Arial"/>
+          <w:color w:val="000000"/>
+          <w:lang w:eastAsia="pl-PL"/>
+        </w:rPr>
+        <w:t xml:space="preserve"> "Comment"</w:t>
+      </w:r>
+      <w:r>
+        <w:rPr>
+          <w:rFonts w:ascii="Arial" w:eastAsia="Times New Roman" w:hAnsi="Arial" w:cs="Arial"/>
+          <w:color w:val="000000"/>
+          <w:lang w:eastAsia="pl-PL"/>
+        </w:rPr>
+        <w:t>.</w:t>
       </w:r>
     </w:p>
     <w:p>
@@ -4050,7 +4349,39 @@
           <w:color w:val="000000"/>
           <w:lang w:eastAsia="pl-PL"/>
         </w:rPr>
-        <w:t>he User can also report inappropriate comments.</w:t>
+        <w:t>he User can also</w:t>
+      </w:r>
+      <w:r>
+        <w:rPr>
+          <w:rFonts w:ascii="Arial" w:eastAsia="Times New Roman" w:hAnsi="Arial" w:cs="Arial"/>
+          <w:color w:val="000000"/>
+          <w:lang w:eastAsia="pl-PL"/>
+        </w:rPr>
+        <w:t xml:space="preserve"> select “Report”</w:t>
+      </w:r>
+      <w:r>
+        <w:rPr>
+          <w:rFonts w:ascii="Arial" w:eastAsia="Times New Roman" w:hAnsi="Arial" w:cs="Arial"/>
+          <w:color w:val="000000"/>
+          <w:lang w:eastAsia="pl-PL"/>
+        </w:rPr>
+        <w:t xml:space="preserve"> </w:t>
+      </w:r>
+      <w:r>
+        <w:rPr>
+          <w:rFonts w:ascii="Arial" w:eastAsia="Times New Roman" w:hAnsi="Arial" w:cs="Arial"/>
+          <w:color w:val="000000"/>
+          <w:lang w:eastAsia="pl-PL"/>
+        </w:rPr>
+        <w:t xml:space="preserve">to </w:t>
+      </w:r>
+      <w:r>
+        <w:rPr>
+          <w:rFonts w:ascii="Arial" w:eastAsia="Times New Roman" w:hAnsi="Arial" w:cs="Arial"/>
+          <w:color w:val="000000"/>
+          <w:lang w:eastAsia="pl-PL"/>
+        </w:rPr>
+        <w:t>report inappropriate comments.</w:t>
       </w:r>
     </w:p>
     <w:p>
@@ -4067,7 +4398,7 @@
       <w:pPr>
         <w:spacing w:after="0" w:line="240" w:lineRule="auto"/>
         <w:rPr>
-          <w:rFonts w:ascii="Times New Roman" w:eastAsia="Times New Roman" w:hAnsi="Times New Roman" w:cs="Times New Roman"/>
+          <w:rFonts w:ascii="Arial" w:eastAsia="Times New Roman" w:hAnsi="Arial" w:cs="Arial"/>
           <w:sz w:val="24"/>
           <w:szCs w:val="24"/>
           <w:lang w:eastAsia="pl-PL"/>
@@ -4081,7 +4412,6 @@
           <w:color w:val="000000"/>
           <w:lang w:eastAsia="pl-PL"/>
         </w:rPr>
-        <w:lastRenderedPageBreak/>
         <w:t>Extensions:</w:t>
       </w:r>
     </w:p>
@@ -4125,7 +4455,59 @@
         <w:spacing w:before="360" w:after="120" w:line="240" w:lineRule="auto"/>
         <w:outlineLvl w:val="1"/>
         <w:rPr>
-          <w:rFonts w:ascii="Times New Roman" w:eastAsia="Times New Roman" w:hAnsi="Times New Roman" w:cs="Times New Roman"/>
+          <w:rFonts w:ascii="Arial" w:eastAsia="Times New Roman" w:hAnsi="Arial" w:cs="Arial"/>
+          <w:color w:val="000000"/>
+          <w:sz w:val="32"/>
+          <w:szCs w:val="32"/>
+          <w:lang w:eastAsia="pl-PL"/>
+        </w:rPr>
+      </w:pPr>
+    </w:p>
+    <w:p>
+      <w:pPr>
+        <w:spacing w:before="360" w:after="120" w:line="240" w:lineRule="auto"/>
+        <w:outlineLvl w:val="1"/>
+        <w:rPr>
+          <w:rFonts w:ascii="Arial" w:eastAsia="Times New Roman" w:hAnsi="Arial" w:cs="Arial"/>
+          <w:color w:val="000000"/>
+          <w:sz w:val="32"/>
+          <w:szCs w:val="32"/>
+          <w:lang w:eastAsia="pl-PL"/>
+        </w:rPr>
+      </w:pPr>
+    </w:p>
+    <w:p>
+      <w:pPr>
+        <w:spacing w:before="360" w:after="120" w:line="240" w:lineRule="auto"/>
+        <w:outlineLvl w:val="1"/>
+        <w:rPr>
+          <w:rFonts w:ascii="Arial" w:eastAsia="Times New Roman" w:hAnsi="Arial" w:cs="Arial"/>
+          <w:color w:val="000000"/>
+          <w:sz w:val="32"/>
+          <w:szCs w:val="32"/>
+          <w:lang w:eastAsia="pl-PL"/>
+        </w:rPr>
+      </w:pPr>
+    </w:p>
+    <w:p>
+      <w:pPr>
+        <w:spacing w:before="360" w:after="120" w:line="240" w:lineRule="auto"/>
+        <w:outlineLvl w:val="1"/>
+        <w:rPr>
+          <w:rFonts w:ascii="Arial" w:eastAsia="Times New Roman" w:hAnsi="Arial" w:cs="Arial"/>
+          <w:color w:val="000000"/>
+          <w:sz w:val="32"/>
+          <w:szCs w:val="32"/>
+          <w:lang w:eastAsia="pl-PL"/>
+        </w:rPr>
+      </w:pPr>
+    </w:p>
+    <w:p>
+      <w:pPr>
+        <w:spacing w:before="360" w:after="120" w:line="240" w:lineRule="auto"/>
+        <w:outlineLvl w:val="1"/>
+        <w:rPr>
+          <w:rFonts w:ascii="Arial" w:eastAsia="Times New Roman" w:hAnsi="Arial" w:cs="Arial"/>
           <w:b/>
           <w:bCs/>
           <w:sz w:val="36"/>
@@ -4141,6 +4523,7 @@
           <w:szCs w:val="32"/>
           <w:lang w:eastAsia="pl-PL"/>
         </w:rPr>
+        <w:lastRenderedPageBreak/>
         <w:t xml:space="preserve">UC3. </w:t>
       </w:r>
       <w:r>
@@ -4158,7 +4541,7 @@
       <w:pPr>
         <w:spacing w:after="0" w:line="240" w:lineRule="auto"/>
         <w:rPr>
-          <w:rFonts w:ascii="Times New Roman" w:eastAsia="Times New Roman" w:hAnsi="Times New Roman" w:cs="Times New Roman"/>
+          <w:rFonts w:ascii="Arial" w:eastAsia="Times New Roman" w:hAnsi="Arial" w:cs="Arial"/>
           <w:sz w:val="24"/>
           <w:szCs w:val="24"/>
           <w:lang w:eastAsia="pl-PL"/>
@@ -4185,7 +4568,7 @@
       <w:pPr>
         <w:spacing w:after="0" w:line="240" w:lineRule="auto"/>
         <w:rPr>
-          <w:rFonts w:ascii="Times New Roman" w:eastAsia="Times New Roman" w:hAnsi="Times New Roman" w:cs="Times New Roman"/>
+          <w:rFonts w:ascii="Arial" w:eastAsia="Times New Roman" w:hAnsi="Arial" w:cs="Arial"/>
           <w:sz w:val="24"/>
           <w:szCs w:val="24"/>
           <w:lang w:eastAsia="pl-PL"/>
@@ -4212,7 +4595,7 @@
       <w:pPr>
         <w:spacing w:after="0" w:line="240" w:lineRule="auto"/>
         <w:rPr>
-          <w:rFonts w:ascii="Times New Roman" w:eastAsia="Times New Roman" w:hAnsi="Times New Roman" w:cs="Times New Roman"/>
+          <w:rFonts w:ascii="Arial" w:eastAsia="Times New Roman" w:hAnsi="Arial" w:cs="Arial"/>
           <w:sz w:val="24"/>
           <w:szCs w:val="24"/>
           <w:lang w:eastAsia="pl-PL"/>
@@ -4232,24 +4615,14 @@
           <w:color w:val="0D0D0D"/>
           <w:lang w:eastAsia="pl-PL"/>
         </w:rPr>
-        <w:t xml:space="preserve">a registered </w:t>
-      </w:r>
-      <w:proofErr w:type="gramStart"/>
-      <w:r>
-        <w:rPr>
-          <w:rFonts w:ascii="Arial" w:eastAsia="Times New Roman" w:hAnsi="Arial" w:cs="Arial"/>
-          <w:color w:val="0D0D0D"/>
-          <w:lang w:eastAsia="pl-PL"/>
-        </w:rPr>
-        <w:t>user</w:t>
-      </w:r>
-      <w:proofErr w:type="gramEnd"/>
+        <w:t>a registered user</w:t>
+      </w:r>
     </w:p>
     <w:p>
       <w:pPr>
         <w:spacing w:after="0" w:line="240" w:lineRule="auto"/>
         <w:rPr>
-          <w:rFonts w:ascii="Times New Roman" w:eastAsia="Times New Roman" w:hAnsi="Times New Roman" w:cs="Times New Roman"/>
+          <w:rFonts w:ascii="Arial" w:eastAsia="Times New Roman" w:hAnsi="Arial" w:cs="Arial"/>
           <w:sz w:val="24"/>
           <w:szCs w:val="24"/>
           <w:lang w:eastAsia="pl-PL"/>
@@ -4260,7 +4633,7 @@
       <w:pPr>
         <w:spacing w:after="0" w:line="240" w:lineRule="auto"/>
         <w:rPr>
-          <w:rFonts w:ascii="Times New Roman" w:eastAsia="Times New Roman" w:hAnsi="Times New Roman" w:cs="Times New Roman"/>
+          <w:rFonts w:ascii="Arial" w:eastAsia="Times New Roman" w:hAnsi="Arial" w:cs="Arial"/>
           <w:sz w:val="24"/>
           <w:szCs w:val="24"/>
           <w:lang w:eastAsia="pl-PL"/>
@@ -4278,22 +4651,14 @@
     <w:p>
       <w:pPr>
         <w:spacing w:after="0" w:line="240" w:lineRule="auto"/>
-        <w:rPr>
-          <w:rFonts w:ascii="Times New Roman" w:eastAsia="Times New Roman" w:hAnsi="Times New Roman" w:cs="Times New Roman"/>
-          <w:sz w:val="24"/>
-          <w:szCs w:val="24"/>
-          <w:lang w:eastAsia="pl-PL"/>
-        </w:rPr>
-      </w:pPr>
-      <w:r>
-        <w:rPr>
-          <w:rFonts w:ascii="Times New Roman" w:eastAsia="Times New Roman" w:hAnsi="Times New Roman" w:cs="Times New Roman"/>
-          <w:sz w:val="24"/>
-          <w:szCs w:val="24"/>
-          <w:lang w:eastAsia="pl-PL"/>
-        </w:rPr>
-        <w:br/>
-      </w:r>
+        <w:ind w:left="720"/>
+        <w:textAlignment w:val="baseline"/>
+        <w:rPr>
+          <w:rFonts w:ascii="Arial" w:eastAsia="Times New Roman" w:hAnsi="Arial" w:cs="Arial"/>
+          <w:color w:val="000000"/>
+          <w:lang w:eastAsia="pl-PL"/>
+        </w:rPr>
+      </w:pPr>
     </w:p>
     <w:p>
       <w:pPr>
@@ -4434,7 +4799,7 @@
       <w:pPr>
         <w:spacing w:after="0" w:line="240" w:lineRule="auto"/>
         <w:rPr>
-          <w:rFonts w:ascii="Times New Roman" w:eastAsia="Times New Roman" w:hAnsi="Times New Roman" w:cs="Times New Roman"/>
+          <w:rFonts w:ascii="Arial" w:eastAsia="Times New Roman" w:hAnsi="Arial" w:cs="Arial"/>
           <w:sz w:val="24"/>
           <w:szCs w:val="24"/>
           <w:lang w:eastAsia="pl-PL"/>
@@ -4458,7 +4823,8 @@
         <w:textAlignment w:val="baseline"/>
         <w:rPr>
           <w:rFonts w:ascii="Arial" w:eastAsia="Times New Roman" w:hAnsi="Arial" w:cs="Arial"/>
-          <w:color w:val="0D0D0D"/>
+          <w:sz w:val="24"/>
+          <w:szCs w:val="24"/>
           <w:lang w:eastAsia="pl-PL"/>
         </w:rPr>
       </w:pPr>
@@ -4500,7 +4866,7 @@
         <w:spacing w:before="360" w:after="120" w:line="240" w:lineRule="auto"/>
         <w:outlineLvl w:val="1"/>
         <w:rPr>
-          <w:rFonts w:ascii="Times New Roman" w:eastAsia="Times New Roman" w:hAnsi="Times New Roman" w:cs="Times New Roman"/>
+          <w:rFonts w:ascii="Arial" w:eastAsia="Times New Roman" w:hAnsi="Arial" w:cs="Arial"/>
           <w:b/>
           <w:bCs/>
           <w:sz w:val="36"/>
@@ -4543,7 +4909,7 @@
       <w:pPr>
         <w:spacing w:after="0" w:line="240" w:lineRule="auto"/>
         <w:rPr>
-          <w:rFonts w:ascii="Times New Roman" w:eastAsia="Times New Roman" w:hAnsi="Times New Roman" w:cs="Times New Roman"/>
+          <w:rFonts w:ascii="Arial" w:eastAsia="Times New Roman" w:hAnsi="Arial" w:cs="Arial"/>
           <w:sz w:val="24"/>
           <w:szCs w:val="24"/>
           <w:lang w:eastAsia="pl-PL"/>
@@ -4555,14 +4921,22 @@
           <w:color w:val="0D0D0D"/>
           <w:lang w:eastAsia="pl-PL"/>
         </w:rPr>
-        <w:t>Actor: Employee</w:t>
+        <w:t xml:space="preserve">Actor: </w:t>
+      </w:r>
+      <w:r>
+        <w:rPr>
+          <w:rFonts w:ascii="Arial" w:eastAsia="Times New Roman" w:hAnsi="Arial" w:cs="Arial"/>
+          <w:color w:val="0D0D0D"/>
+          <w:lang w:eastAsia="pl-PL"/>
+        </w:rPr>
+        <w:t>Admin</w:t>
       </w:r>
     </w:p>
     <w:p>
       <w:pPr>
         <w:spacing w:after="0" w:line="240" w:lineRule="auto"/>
         <w:rPr>
-          <w:rFonts w:ascii="Times New Roman" w:eastAsia="Times New Roman" w:hAnsi="Times New Roman" w:cs="Times New Roman"/>
+          <w:rFonts w:ascii="Arial" w:eastAsia="Times New Roman" w:hAnsi="Arial" w:cs="Arial"/>
           <w:sz w:val="24"/>
           <w:szCs w:val="24"/>
           <w:lang w:eastAsia="pl-PL"/>
@@ -4597,7 +4971,7 @@
       <w:pPr>
         <w:spacing w:after="0" w:line="240" w:lineRule="auto"/>
         <w:rPr>
-          <w:rFonts w:ascii="Times New Roman" w:eastAsia="Times New Roman" w:hAnsi="Times New Roman" w:cs="Times New Roman"/>
+          <w:rFonts w:ascii="Arial" w:eastAsia="Times New Roman" w:hAnsi="Arial" w:cs="Arial"/>
           <w:sz w:val="24"/>
           <w:szCs w:val="24"/>
           <w:lang w:eastAsia="pl-PL"/>
@@ -4625,24 +4999,14 @@
           <w:color w:val="0D0D0D"/>
           <w:lang w:eastAsia="pl-PL"/>
         </w:rPr>
-        <w:t xml:space="preserve">opens </w:t>
-      </w:r>
-      <w:proofErr w:type="gramStart"/>
-      <w:r>
-        <w:rPr>
-          <w:rFonts w:ascii="Arial" w:eastAsia="Times New Roman" w:hAnsi="Arial" w:cs="Arial"/>
-          <w:color w:val="0D0D0D"/>
-          <w:lang w:eastAsia="pl-PL"/>
-        </w:rPr>
-        <w:t>App</w:t>
-      </w:r>
-      <w:proofErr w:type="gramEnd"/>
+        <w:t>opens App</w:t>
+      </w:r>
     </w:p>
     <w:p>
       <w:pPr>
         <w:spacing w:after="0" w:line="240" w:lineRule="auto"/>
         <w:rPr>
-          <w:rFonts w:ascii="Times New Roman" w:eastAsia="Times New Roman" w:hAnsi="Times New Roman" w:cs="Times New Roman"/>
+          <w:rFonts w:ascii="Arial" w:eastAsia="Times New Roman" w:hAnsi="Arial" w:cs="Arial"/>
           <w:sz w:val="24"/>
           <w:szCs w:val="24"/>
           <w:lang w:eastAsia="pl-PL"/>
@@ -4653,7 +5017,7 @@
       <w:pPr>
         <w:spacing w:after="0" w:line="240" w:lineRule="auto"/>
         <w:rPr>
-          <w:rFonts w:ascii="Times New Roman" w:eastAsia="Times New Roman" w:hAnsi="Times New Roman" w:cs="Times New Roman"/>
+          <w:rFonts w:ascii="Arial" w:eastAsia="Times New Roman" w:hAnsi="Arial" w:cs="Arial"/>
           <w:sz w:val="24"/>
           <w:szCs w:val="24"/>
           <w:lang w:eastAsia="pl-PL"/>
@@ -4671,22 +5035,16 @@
     <w:p>
       <w:pPr>
         <w:spacing w:after="0" w:line="240" w:lineRule="auto"/>
-        <w:rPr>
-          <w:rFonts w:ascii="Times New Roman" w:eastAsia="Times New Roman" w:hAnsi="Times New Roman" w:cs="Times New Roman"/>
+        <w:ind w:left="1440"/>
+        <w:textAlignment w:val="baseline"/>
+        <w:rPr>
+          <w:rFonts w:ascii="Arial" w:eastAsia="Times New Roman" w:hAnsi="Arial" w:cs="Arial"/>
+          <w:color w:val="0D0D0D"/>
           <w:sz w:val="24"/>
           <w:szCs w:val="24"/>
           <w:lang w:eastAsia="pl-PL"/>
         </w:rPr>
       </w:pPr>
-      <w:r>
-        <w:rPr>
-          <w:rFonts w:ascii="Times New Roman" w:eastAsia="Times New Roman" w:hAnsi="Times New Roman" w:cs="Times New Roman"/>
-          <w:sz w:val="24"/>
-          <w:szCs w:val="24"/>
-          <w:lang w:eastAsia="pl-PL"/>
-        </w:rPr>
-        <w:br/>
-      </w:r>
     </w:p>
     <w:p>
       <w:pPr>
@@ -4698,7 +5056,7 @@
         <w:ind w:left="1440"/>
         <w:textAlignment w:val="baseline"/>
         <w:rPr>
-          <w:rFonts w:ascii="Roboto" w:eastAsia="Times New Roman" w:hAnsi="Roboto" w:cs="Times New Roman"/>
+          <w:rFonts w:ascii="Arial" w:eastAsia="Times New Roman" w:hAnsi="Arial" w:cs="Arial"/>
           <w:color w:val="0D0D0D"/>
           <w:sz w:val="24"/>
           <w:szCs w:val="24"/>
@@ -4735,43 +5093,39 @@
           <w:color w:val="000000"/>
           <w:lang w:eastAsia="pl-PL"/>
         </w:rPr>
-        <w:t xml:space="preserve">The system displays a Dashboard with a </w:t>
-      </w:r>
-      <w:proofErr w:type="spellStart"/>
-      <w:r>
-        <w:rPr>
-          <w:rFonts w:ascii="Arial" w:eastAsia="Times New Roman" w:hAnsi="Arial" w:cs="Arial"/>
-          <w:color w:val="000000"/>
-          <w:lang w:eastAsia="pl-PL"/>
-        </w:rPr>
-        <w:t>listbox</w:t>
-      </w:r>
-      <w:proofErr w:type="spellEnd"/>
-      <w:r>
-        <w:rPr>
-          <w:rFonts w:ascii="Arial" w:eastAsia="Times New Roman" w:hAnsi="Arial" w:cs="Arial"/>
-          <w:color w:val="000000"/>
-          <w:lang w:eastAsia="pl-PL"/>
-        </w:rPr>
-        <w:t xml:space="preserve"> with tasks, animals, </w:t>
-      </w:r>
-      <w:proofErr w:type="gramStart"/>
-      <w:r>
-        <w:rPr>
-          <w:rFonts w:ascii="Arial" w:eastAsia="Times New Roman" w:hAnsi="Arial" w:cs="Arial"/>
-          <w:color w:val="000000"/>
-          <w:lang w:eastAsia="pl-PL"/>
-        </w:rPr>
-        <w:t>locations</w:t>
-      </w:r>
-      <w:proofErr w:type="gramEnd"/>
-      <w:r>
-        <w:rPr>
-          <w:rFonts w:ascii="Arial" w:eastAsia="Times New Roman" w:hAnsi="Arial" w:cs="Arial"/>
-          <w:color w:val="000000"/>
-          <w:lang w:eastAsia="pl-PL"/>
-        </w:rPr>
-        <w:t xml:space="preserve"> and employees as well as buttons to Create, Update or Delete an item.</w:t>
+        <w:t>The system displays a Dashboard with</w:t>
+      </w:r>
+      <w:r>
+        <w:rPr>
+          <w:rFonts w:ascii="Arial" w:eastAsia="Times New Roman" w:hAnsi="Arial" w:cs="Arial"/>
+          <w:color w:val="000000"/>
+          <w:lang w:eastAsia="pl-PL"/>
+        </w:rPr>
+        <w:t xml:space="preserve"> </w:t>
+      </w:r>
+      <w:r>
+        <w:rPr>
+          <w:rFonts w:ascii="Arial" w:eastAsia="Times New Roman" w:hAnsi="Arial" w:cs="Arial"/>
+          <w:color w:val="000000"/>
+          <w:lang w:eastAsia="pl-PL"/>
+        </w:rPr>
+        <w:t xml:space="preserve">three buttons to navigate through the system. Users, </w:t>
+      </w:r>
+      <w:r>
+        <w:rPr>
+          <w:rFonts w:ascii="Arial" w:eastAsia="Times New Roman" w:hAnsi="Arial" w:cs="Arial"/>
+          <w:color w:val="000000"/>
+          <w:lang w:eastAsia="pl-PL"/>
+        </w:rPr>
+        <w:t>Music,</w:t>
+      </w:r>
+      <w:r>
+        <w:rPr>
+          <w:rFonts w:ascii="Arial" w:eastAsia="Times New Roman" w:hAnsi="Arial" w:cs="Arial"/>
+          <w:color w:val="000000"/>
+          <w:lang w:eastAsia="pl-PL"/>
+        </w:rPr>
+        <w:t xml:space="preserve"> and Reviews</w:t>
       </w:r>
     </w:p>
     <w:p>
@@ -4795,7 +5149,23 @@
           <w:color w:val="000000"/>
           <w:lang w:eastAsia="pl-PL"/>
         </w:rPr>
-        <w:t>The actor filters by category.</w:t>
+        <w:t xml:space="preserve">The actor </w:t>
+      </w:r>
+      <w:r>
+        <w:rPr>
+          <w:rFonts w:ascii="Arial" w:eastAsia="Times New Roman" w:hAnsi="Arial" w:cs="Arial"/>
+          <w:color w:val="000000"/>
+          <w:lang w:eastAsia="pl-PL"/>
+        </w:rPr>
+        <w:t xml:space="preserve">selects one of the buttons </w:t>
+      </w:r>
+      <w:r>
+        <w:rPr>
+          <w:rFonts w:ascii="Arial" w:eastAsia="Times New Roman" w:hAnsi="Arial" w:cs="Arial"/>
+          <w:color w:val="000000"/>
+          <w:lang w:eastAsia="pl-PL"/>
+        </w:rPr>
+        <w:t>depending on what they want to do.</w:t>
       </w:r>
     </w:p>
     <w:p>
@@ -4808,7 +5178,7 @@
         <w:ind w:left="1440"/>
         <w:textAlignment w:val="baseline"/>
         <w:rPr>
-          <w:rFonts w:ascii="Roboto" w:eastAsia="Times New Roman" w:hAnsi="Roboto" w:cs="Times New Roman"/>
+          <w:rFonts w:ascii="Arial" w:eastAsia="Times New Roman" w:hAnsi="Arial" w:cs="Arial"/>
           <w:color w:val="0D0D0D"/>
           <w:sz w:val="24"/>
           <w:szCs w:val="24"/>
@@ -4821,7 +5191,23 @@
           <w:color w:val="000000"/>
           <w:lang w:eastAsia="pl-PL"/>
         </w:rPr>
-        <w:t>The system shows appropriate items.</w:t>
+        <w:t xml:space="preserve">The system </w:t>
+      </w:r>
+      <w:r>
+        <w:rPr>
+          <w:rFonts w:ascii="Arial" w:eastAsia="Times New Roman" w:hAnsi="Arial" w:cs="Arial"/>
+          <w:color w:val="000000"/>
+          <w:lang w:eastAsia="pl-PL"/>
+        </w:rPr>
+        <w:t>opens the appropriate form</w:t>
+      </w:r>
+      <w:r>
+        <w:rPr>
+          <w:rFonts w:ascii="Arial" w:eastAsia="Times New Roman" w:hAnsi="Arial" w:cs="Arial"/>
+          <w:color w:val="000000"/>
+          <w:lang w:eastAsia="pl-PL"/>
+        </w:rPr>
+        <w:t>.</w:t>
       </w:r>
     </w:p>
     <w:p>
@@ -4845,7 +5231,23 @@
           <w:color w:val="000000"/>
           <w:lang w:eastAsia="pl-PL"/>
         </w:rPr>
-        <w:t>The actor selects an item.</w:t>
+        <w:t xml:space="preserve">The actor </w:t>
+      </w:r>
+      <w:r>
+        <w:rPr>
+          <w:rFonts w:ascii="Arial" w:eastAsia="Times New Roman" w:hAnsi="Arial" w:cs="Arial"/>
+          <w:color w:val="000000"/>
+          <w:lang w:eastAsia="pl-PL"/>
+        </w:rPr>
+        <w:t>does or changes what he wants</w:t>
+      </w:r>
+      <w:r>
+        <w:rPr>
+          <w:rFonts w:ascii="Arial" w:eastAsia="Times New Roman" w:hAnsi="Arial" w:cs="Arial"/>
+          <w:color w:val="000000"/>
+          <w:lang w:eastAsia="pl-PL"/>
+        </w:rPr>
+        <w:t>.</w:t>
       </w:r>
     </w:p>
     <w:p>
@@ -4869,14 +5271,22 @@
           <w:color w:val="0D0D0D"/>
           <w:lang w:eastAsia="pl-PL"/>
         </w:rPr>
-        <w:t>The system shows item information.</w:t>
+        <w:t xml:space="preserve">The system </w:t>
+      </w:r>
+      <w:r>
+        <w:rPr>
+          <w:rFonts w:ascii="Arial" w:eastAsia="Times New Roman" w:hAnsi="Arial" w:cs="Arial"/>
+          <w:color w:val="0D0D0D"/>
+          <w:lang w:eastAsia="pl-PL"/>
+        </w:rPr>
+        <w:t>saves the changes if any were made.</w:t>
       </w:r>
     </w:p>
     <w:p>
       <w:pPr>
         <w:spacing w:after="0" w:line="240" w:lineRule="auto"/>
         <w:rPr>
-          <w:rFonts w:ascii="Times New Roman" w:eastAsia="Times New Roman" w:hAnsi="Times New Roman" w:cs="Times New Roman"/>
+          <w:rFonts w:ascii="Arial" w:eastAsia="Times New Roman" w:hAnsi="Arial" w:cs="Arial"/>
           <w:sz w:val="24"/>
           <w:szCs w:val="24"/>
           <w:lang w:eastAsia="pl-PL"/>
@@ -4887,7 +5297,7 @@
       <w:pPr>
         <w:spacing w:after="0" w:line="240" w:lineRule="auto"/>
         <w:rPr>
-          <w:rFonts w:ascii="Times New Roman" w:eastAsia="Times New Roman" w:hAnsi="Times New Roman" w:cs="Times New Roman"/>
+          <w:rFonts w:ascii="Arial" w:eastAsia="Times New Roman" w:hAnsi="Arial" w:cs="Arial"/>
           <w:sz w:val="24"/>
           <w:szCs w:val="24"/>
           <w:lang w:eastAsia="pl-PL"/>
@@ -4902,6 +5312,26 @@
           <w:lang w:eastAsia="pl-PL"/>
         </w:rPr>
         <w:t>Extensions:</w:t>
+      </w:r>
+    </w:p>
+    <w:p>
+      <w:pPr>
+        <w:spacing w:after="0" w:line="240" w:lineRule="auto"/>
+        <w:ind w:left="720"/>
+        <w:textAlignment w:val="baseline"/>
+        <w:rPr>
+          <w:rFonts w:ascii="Arial" w:eastAsia="Times New Roman" w:hAnsi="Arial" w:cs="Arial"/>
+          <w:color w:val="0D0D0D"/>
+          <w:lang w:eastAsia="pl-PL"/>
+        </w:rPr>
+      </w:pPr>
+      <w:r>
+        <w:rPr>
+          <w:rFonts w:ascii="Arial" w:eastAsia="Times New Roman" w:hAnsi="Arial" w:cs="Arial"/>
+          <w:color w:val="0D0D0D"/>
+          <w:lang w:eastAsia="pl-PL"/>
+        </w:rPr>
+        <w:t> </w:t>
       </w:r>
     </w:p>
     <w:p>
@@ -4924,7 +5354,7 @@
           <w:color w:val="0D0D0D"/>
           <w:lang w:eastAsia="pl-PL"/>
         </w:rPr>
-        <w:t> The Username and Password don’t match the records in the Database.</w:t>
+        <w:t>The Username and Password don’t match the records in the Database.</w:t>
       </w:r>
     </w:p>
     <w:p>
@@ -4947,7 +5377,7 @@
           <w:color w:val="0D0D0D"/>
           <w:lang w:eastAsia="pl-PL"/>
         </w:rPr>
-        <w:t> The System tells the Actor that the password and username don’t match any known User.</w:t>
+        <w:t>The System tells the Actor that the password and username don’t match any known User.</w:t>
       </w:r>
     </w:p>
     <w:p>
@@ -4970,7 +5400,7 @@
           <w:color w:val="0D0D0D"/>
           <w:lang w:eastAsia="pl-PL"/>
         </w:rPr>
-        <w:t> The Actor inputs the right username and password.</w:t>
+        <w:t>The Actor inputs the right username and password.</w:t>
       </w:r>
     </w:p>
     <w:p>
@@ -4993,30 +5423,20 @@
           <w:color w:val="0D0D0D"/>
           <w:lang w:eastAsia="pl-PL"/>
         </w:rPr>
-        <w:t> Proceed to step 2.</w:t>
+        <w:t>Proceed to step 2.</w:t>
       </w:r>
     </w:p>
     <w:p>
       <w:pPr>
         <w:spacing w:after="0" w:line="240" w:lineRule="auto"/>
         <w:rPr>
-          <w:rFonts w:ascii="Times New Roman" w:eastAsia="Times New Roman" w:hAnsi="Times New Roman" w:cs="Times New Roman"/>
+          <w:rFonts w:ascii="Arial" w:eastAsia="Times New Roman" w:hAnsi="Arial" w:cs="Arial"/>
           <w:sz w:val="24"/>
           <w:szCs w:val="24"/>
           <w:lang w:eastAsia="pl-PL"/>
         </w:rPr>
       </w:pPr>
-      <w:r>
-        <w:rPr>
-          <w:rFonts w:ascii="Times New Roman" w:eastAsia="Times New Roman" w:hAnsi="Times New Roman" w:cs="Times New Roman"/>
-          <w:sz w:val="24"/>
-          <w:szCs w:val="24"/>
-          <w:lang w:eastAsia="pl-PL"/>
-        </w:rPr>
-        <w:br/>
-      </w:r>
-    </w:p>
-    <w:p/>
+    </w:p>
     <w:sectPr>
       <w:pgSz w:w="11906" w:h="16838"/>
       <w:pgMar w:top="1440" w:right="1440" w:bottom="1440" w:left="1440" w:header="708" w:footer="708" w:gutter="0"/>

</xml_diff>